<commit_message>
Phase 4: add WorldClim climate covariates; collinearity analysis
WorldClim host reachable -> added climate zonal means (build_climate.py) and
collinearity/PCA analysis (climate_analysis.py).

Finding: climate is the north-south gradient, not an independent driver.
Latitude-rainfall r=-.92, latitude-temp-seasonality r=.97; VIFs up to 56; PCA
PC1=91.3%. Only population density is orthogonal (VIF 1.3). Parsimonious
low-VIF model: rainfall seasonality IRR 0.31 [0.17,0.57] and density IRR 0.23
[0.11,0.49], both p<.001; reservoir ns. Poverty coefficient unstable across
specifications.

Manuscript updated: climate rows in Table 1, new climate/dimensionality
subsection, Table 3 (parsimonious model); .docx regenerated. FINDINGS,
VARIABLES, README synced.

Co-Authored-By: Claude Opus 4.8 <noreply@anthropic.com>
Claude-Session: https://claude.ai/code/session_019cbq1tyoouCuxchqATwqmE
</commit_message>
<xml_diff>
--- a/lassa_spatial/manuscript/Results_section_APA.docx
+++ b/lassa_spatial/manuscript/Results_section_APA.docx
@@ -733,6 +733,225 @@
           <w:szCs w:val="24"/>
         </w:rPr>
         <w:t xml:space="preserve"> = −.06); because occurrence records reflect trapping effort rather than abundance (the highest-incidence state, Ondo, had zero records), this variable was retained only as a sensitivity covariate.</w:t>
+      </w:r>
+    </w:p>
+    <w:p>
+      <w:pPr>
+        <w:spacing w:after="0" w:before="120" w:line="480"/>
+      </w:pPr>
+      <w:r>
+        <w:rPr>
+          <w:rFonts w:ascii="Times New Roman" w:cs="Times New Roman" w:eastAsia="Times New Roman" w:hAnsi="Times New Roman"/>
+          <w:b/>
+          <w:bCs/>
+          <w:sz w:val="24"/>
+          <w:szCs w:val="24"/>
+        </w:rPr>
+        <w:t xml:space="preserve">Climate Covariates and the Dimensionality of the Risk Gradient</w:t>
+      </w:r>
+    </w:p>
+    <w:p>
+      <w:pPr>
+        <w:spacing w:after="0" w:line="480"/>
+        <w:ind w:firstLine="720"/>
+      </w:pPr>
+      <w:r>
+        <w:rPr>
+          <w:rFonts w:ascii="Times New Roman" w:cs="Times New Roman" w:eastAsia="Times New Roman" w:hAnsi="Times New Roman"/>
+          <w:b w:val="false"/>
+          <w:bCs w:val="false"/>
+          <w:i w:val="false"/>
+          <w:iCs w:val="false"/>
+          <w:sz w:val="24"/>
+          <w:szCs w:val="24"/>
+        </w:rPr>
+        <w:t xml:space="preserve">State-level climate normals (WorldClim 2.1, 5-arc-minute zonal means) mirrored the latitudinal gradient closely: annual rainfall ranged from 488 mm in the arid northeast (Yobe) to 3,115 mm on the southern coast (Bayelsa), and the southern high-incidence states (Ondo, Edo, Ebonyi) received 1,659–1,880 mm. Climate was, however, almost perfectly collinear with the other gradient predictors. Centroid latitude was correlated </w:t>
+      </w:r>
+      <w:r>
+        <w:rPr>
+          <w:rFonts w:ascii="Times New Roman" w:cs="Times New Roman" w:eastAsia="Times New Roman" w:hAnsi="Times New Roman"/>
+          <w:b w:val="false"/>
+          <w:bCs w:val="false"/>
+          <w:i/>
+          <w:iCs/>
+          <w:sz w:val="24"/>
+          <w:szCs w:val="24"/>
+        </w:rPr>
+        <w:t xml:space="preserve">r</w:t>
+      </w:r>
+      <w:r>
+        <w:rPr>
+          <w:rFonts w:ascii="Times New Roman" w:cs="Times New Roman" w:eastAsia="Times New Roman" w:hAnsi="Times New Roman"/>
+          <w:b w:val="false"/>
+          <w:bCs w:val="false"/>
+          <w:i w:val="false"/>
+          <w:iCs w:val="false"/>
+          <w:sz w:val="24"/>
+          <w:szCs w:val="24"/>
+        </w:rPr>
+        <w:t xml:space="preserve"> = −.92 with annual rainfall, </w:t>
+      </w:r>
+      <w:r>
+        <w:rPr>
+          <w:rFonts w:ascii="Times New Roman" w:cs="Times New Roman" w:eastAsia="Times New Roman" w:hAnsi="Times New Roman"/>
+          <w:b w:val="false"/>
+          <w:bCs w:val="false"/>
+          <w:i/>
+          <w:iCs/>
+          <w:sz w:val="24"/>
+          <w:szCs w:val="24"/>
+        </w:rPr>
+        <w:t xml:space="preserve">r</w:t>
+      </w:r>
+      <w:r>
+        <w:rPr>
+          <w:rFonts w:ascii="Times New Roman" w:cs="Times New Roman" w:eastAsia="Times New Roman" w:hAnsi="Times New Roman"/>
+          <w:b w:val="false"/>
+          <w:bCs w:val="false"/>
+          <w:i w:val="false"/>
+          <w:iCs w:val="false"/>
+          <w:sz w:val="24"/>
+          <w:szCs w:val="24"/>
+        </w:rPr>
+        <w:t xml:space="preserve"> = .95 with rainfall seasonality, </w:t>
+      </w:r>
+      <w:r>
+        <w:rPr>
+          <w:rFonts w:ascii="Times New Roman" w:cs="Times New Roman" w:eastAsia="Times New Roman" w:hAnsi="Times New Roman"/>
+          <w:b w:val="false"/>
+          <w:bCs w:val="false"/>
+          <w:i/>
+          <w:iCs/>
+          <w:sz w:val="24"/>
+          <w:szCs w:val="24"/>
+        </w:rPr>
+        <w:t xml:space="preserve">r</w:t>
+      </w:r>
+      <w:r>
+        <w:rPr>
+          <w:rFonts w:ascii="Times New Roman" w:cs="Times New Roman" w:eastAsia="Times New Roman" w:hAnsi="Times New Roman"/>
+          <w:b w:val="false"/>
+          <w:bCs w:val="false"/>
+          <w:i w:val="false"/>
+          <w:iCs w:val="false"/>
+          <w:sz w:val="24"/>
+          <w:szCs w:val="24"/>
+        </w:rPr>
+        <w:t xml:space="preserve"> = .97 with temperature seasonality, and </w:t>
+      </w:r>
+      <w:r>
+        <w:rPr>
+          <w:rFonts w:ascii="Times New Roman" w:cs="Times New Roman" w:eastAsia="Times New Roman" w:hAnsi="Times New Roman"/>
+          <w:b w:val="false"/>
+          <w:bCs w:val="false"/>
+          <w:i/>
+          <w:iCs/>
+          <w:sz w:val="24"/>
+          <w:szCs w:val="24"/>
+        </w:rPr>
+        <w:t xml:space="preserve">r</w:t>
+      </w:r>
+      <w:r>
+        <w:rPr>
+          <w:rFonts w:ascii="Times New Roman" w:cs="Times New Roman" w:eastAsia="Times New Roman" w:hAnsi="Times New Roman"/>
+          <w:b w:val="false"/>
+          <w:bCs w:val="false"/>
+          <w:i w:val="false"/>
+          <w:iCs w:val="false"/>
+          <w:sz w:val="24"/>
+          <w:szCs w:val="24"/>
+        </w:rPr>
+        <w:t xml:space="preserve"> = .89 with multidimensional poverty. Variance inflation factors in a combined model were accordingly extreme (temperature seasonality = 56.0, rainfall seasonality = 41.4, latitude = 34.8, annual rainfall = 9.3, poverty = 7.0), whereas population density was effectively orthogonal (VIF = 1.3). A principal-components analysis of the five gradient variables confirmed their redundancy: the first component alone accounted for 91.3% of their variance. Latitude, climate, and poverty therefore represent a single latent north–south axis and cannot be identified separately at this spatial scale.</w:t>
+      </w:r>
+    </w:p>
+    <w:p>
+      <w:pPr>
+        <w:spacing w:after="0" w:line="480"/>
+        <w:ind w:firstLine="720"/>
+      </w:pPr>
+      <w:r>
+        <w:rPr>
+          <w:rFonts w:ascii="Times New Roman" w:cs="Times New Roman" w:eastAsia="Times New Roman" w:hAnsi="Times New Roman"/>
+          <w:b w:val="false"/>
+          <w:bCs w:val="false"/>
+          <w:i w:val="false"/>
+          <w:iCs w:val="false"/>
+          <w:sz w:val="24"/>
+          <w:szCs w:val="24"/>
+        </w:rPr>
+        <w:t xml:space="preserve">A low-collinearity model retaining one mechanistic gradient proxy (rainfall seasonality) together with the orthogonal density term reproduced the pattern cleanly and stably: incidence fell with rainfall seasonality, IRR = 0.31, 95% CI [0.17, 0.57], </w:t>
+      </w:r>
+      <w:r>
+        <w:rPr>
+          <w:rFonts w:ascii="Times New Roman" w:cs="Times New Roman" w:eastAsia="Times New Roman" w:hAnsi="Times New Roman"/>
+          <w:b w:val="false"/>
+          <w:bCs w:val="false"/>
+          <w:i/>
+          <w:iCs/>
+          <w:sz w:val="24"/>
+          <w:szCs w:val="24"/>
+        </w:rPr>
+        <w:t xml:space="preserve">p</w:t>
+      </w:r>
+      <w:r>
+        <w:rPr>
+          <w:rFonts w:ascii="Times New Roman" w:cs="Times New Roman" w:eastAsia="Times New Roman" w:hAnsi="Times New Roman"/>
+          <w:b w:val="false"/>
+          <w:bCs w:val="false"/>
+          <w:i w:val="false"/>
+          <w:iCs w:val="false"/>
+          <w:sz w:val="24"/>
+          <w:szCs w:val="24"/>
+        </w:rPr>
+        <w:t xml:space="preserve"> &lt; .001, and with population density, IRR = 0.23, 95% CI [0.11, 0.49], </w:t>
+      </w:r>
+      <w:r>
+        <w:rPr>
+          <w:rFonts w:ascii="Times New Roman" w:cs="Times New Roman" w:eastAsia="Times New Roman" w:hAnsi="Times New Roman"/>
+          <w:b w:val="false"/>
+          <w:bCs w:val="false"/>
+          <w:i/>
+          <w:iCs/>
+          <w:sz w:val="24"/>
+          <w:szCs w:val="24"/>
+        </w:rPr>
+        <w:t xml:space="preserve">p</w:t>
+      </w:r>
+      <w:r>
+        <w:rPr>
+          <w:rFonts w:ascii="Times New Roman" w:cs="Times New Roman" w:eastAsia="Times New Roman" w:hAnsi="Times New Roman"/>
+          <w:b w:val="false"/>
+          <w:bCs w:val="false"/>
+          <w:i w:val="false"/>
+          <w:iCs w:val="false"/>
+          <w:sz w:val="24"/>
+          <w:szCs w:val="24"/>
+        </w:rPr>
+        <w:t xml:space="preserve"> &lt; .001, while reservoir occurrence remained null, IRR = 1.02, 95% CI [0.56, 1.85], </w:t>
+      </w:r>
+      <w:r>
+        <w:rPr>
+          <w:rFonts w:ascii="Times New Roman" w:cs="Times New Roman" w:eastAsia="Times New Roman" w:hAnsi="Times New Roman"/>
+          <w:b w:val="false"/>
+          <w:bCs w:val="false"/>
+          <w:i/>
+          <w:iCs/>
+          <w:sz w:val="24"/>
+          <w:szCs w:val="24"/>
+        </w:rPr>
+        <w:t xml:space="preserve">p</w:t>
+      </w:r>
+      <w:r>
+        <w:rPr>
+          <w:rFonts w:ascii="Times New Roman" w:cs="Times New Roman" w:eastAsia="Times New Roman" w:hAnsi="Times New Roman"/>
+          <w:b w:val="false"/>
+          <w:bCs w:val="false"/>
+          <w:i w:val="false"/>
+          <w:iCs w:val="false"/>
+          <w:sz w:val="24"/>
+          <w:szCs w:val="24"/>
+        </w:rPr>
+        <w:t xml:space="preserve"> = .944 (Table 3). The instability of the poverty coefficient across specifications (positive when conditioned on rainfall, negative when conditioned on dry-season moisture) further indicates that it carries no risk signal independent of the gradient.</w:t>
       </w:r>
     </w:p>
     <w:p>
@@ -4474,6 +4693,854 @@
           </w:p>
         </w:tc>
       </w:tr>
+      <w:tr>
+        <w:tc>
+          <w:tcPr>
+            <w:tcW w:type="dxa" w:w="3360"/>
+            <w:tcBorders>
+              <w:top w:val="none" w:color="FFFFFF" w:sz="0"/>
+              <w:left w:val="none" w:color="FFFFFF" w:sz="0"/>
+              <w:bottom w:val="none" w:color="FFFFFF" w:sz="0"/>
+              <w:right w:val="none" w:color="FFFFFF" w:sz="0"/>
+            </w:tcBorders>
+            <w:tcMar>
+              <w:top w:type="dxa" w:w="20"/>
+              <w:left w:type="dxa" w:w="80"/>
+              <w:bottom w:type="dxa" w:w="20"/>
+              <w:right w:type="dxa" w:w="80"/>
+            </w:tcMar>
+          </w:tcPr>
+          <w:p>
+            <w:pPr>
+              <w:spacing w:after="20" w:before="20" w:line="240"/>
+              <w:jc w:val="left"/>
+            </w:pPr>
+            <w:r>
+              <w:rPr>
+                <w:rFonts w:ascii="Times New Roman" w:cs="Times New Roman" w:eastAsia="Times New Roman" w:hAnsi="Times New Roman"/>
+                <w:b w:val="false"/>
+                <w:bCs w:val="false"/>
+                <w:i w:val="false"/>
+                <w:iCs w:val="false"/>
+                <w:sz w:val="24"/>
+                <w:szCs w:val="24"/>
+              </w:rPr>
+              <w:t xml:space="preserve">Annual mean temperature (°C)</w:t>
+            </w:r>
+          </w:p>
+        </w:tc>
+        <w:tc>
+          <w:tcPr>
+            <w:tcW w:type="dxa" w:w="1300"/>
+            <w:tcBorders>
+              <w:top w:val="none" w:color="FFFFFF" w:sz="0"/>
+              <w:left w:val="none" w:color="FFFFFF" w:sz="0"/>
+              <w:bottom w:val="none" w:color="FFFFFF" w:sz="0"/>
+              <w:right w:val="none" w:color="FFFFFF" w:sz="0"/>
+            </w:tcBorders>
+            <w:tcMar>
+              <w:top w:type="dxa" w:w="20"/>
+              <w:left w:type="dxa" w:w="80"/>
+              <w:bottom w:type="dxa" w:w="20"/>
+              <w:right w:type="dxa" w:w="80"/>
+            </w:tcMar>
+          </w:tcPr>
+          <w:p>
+            <w:pPr>
+              <w:spacing w:after="20" w:before="20" w:line="240"/>
+              <w:jc w:val="center"/>
+            </w:pPr>
+            <w:r>
+              <w:rPr>
+                <w:rFonts w:ascii="Times New Roman" w:cs="Times New Roman" w:eastAsia="Times New Roman" w:hAnsi="Times New Roman"/>
+                <w:b w:val="false"/>
+                <w:bCs w:val="false"/>
+                <w:i w:val="false"/>
+                <w:iCs w:val="false"/>
+                <w:sz w:val="24"/>
+                <w:szCs w:val="24"/>
+              </w:rPr>
+              <w:t xml:space="preserve">26.50</w:t>
+            </w:r>
+          </w:p>
+        </w:tc>
+        <w:tc>
+          <w:tcPr>
+            <w:tcW w:type="dxa" w:w="1150"/>
+            <w:tcBorders>
+              <w:top w:val="none" w:color="FFFFFF" w:sz="0"/>
+              <w:left w:val="none" w:color="FFFFFF" w:sz="0"/>
+              <w:bottom w:val="none" w:color="FFFFFF" w:sz="0"/>
+              <w:right w:val="none" w:color="FFFFFF" w:sz="0"/>
+            </w:tcBorders>
+            <w:tcMar>
+              <w:top w:type="dxa" w:w="20"/>
+              <w:left w:type="dxa" w:w="80"/>
+              <w:bottom w:type="dxa" w:w="20"/>
+              <w:right w:type="dxa" w:w="80"/>
+            </w:tcMar>
+          </w:tcPr>
+          <w:p>
+            <w:pPr>
+              <w:spacing w:after="20" w:before="20" w:line="240"/>
+              <w:jc w:val="center"/>
+            </w:pPr>
+            <w:r>
+              <w:rPr>
+                <w:rFonts w:ascii="Times New Roman" w:cs="Times New Roman" w:eastAsia="Times New Roman" w:hAnsi="Times New Roman"/>
+                <w:b w:val="false"/>
+                <w:bCs w:val="false"/>
+                <w:i w:val="false"/>
+                <w:iCs w:val="false"/>
+                <w:sz w:val="24"/>
+                <w:szCs w:val="24"/>
+              </w:rPr>
+              <w:t xml:space="preserve">0.72</w:t>
+            </w:r>
+          </w:p>
+        </w:tc>
+        <w:tc>
+          <w:tcPr>
+            <w:tcW w:type="dxa" w:w="1150"/>
+            <w:tcBorders>
+              <w:top w:val="none" w:color="FFFFFF" w:sz="0"/>
+              <w:left w:val="none" w:color="FFFFFF" w:sz="0"/>
+              <w:bottom w:val="none" w:color="FFFFFF" w:sz="0"/>
+              <w:right w:val="none" w:color="FFFFFF" w:sz="0"/>
+            </w:tcBorders>
+            <w:tcMar>
+              <w:top w:type="dxa" w:w="20"/>
+              <w:left w:type="dxa" w:w="80"/>
+              <w:bottom w:type="dxa" w:w="20"/>
+              <w:right w:type="dxa" w:w="80"/>
+            </w:tcMar>
+          </w:tcPr>
+          <w:p>
+            <w:pPr>
+              <w:spacing w:after="20" w:before="20" w:line="240"/>
+              <w:jc w:val="center"/>
+            </w:pPr>
+            <w:r>
+              <w:rPr>
+                <w:rFonts w:ascii="Times New Roman" w:cs="Times New Roman" w:eastAsia="Times New Roman" w:hAnsi="Times New Roman"/>
+                <w:b w:val="false"/>
+                <w:bCs w:val="false"/>
+                <w:i w:val="false"/>
+                <w:iCs w:val="false"/>
+                <w:sz w:val="24"/>
+                <w:szCs w:val="24"/>
+              </w:rPr>
+              <w:t xml:space="preserve">26.40</w:t>
+            </w:r>
+          </w:p>
+        </w:tc>
+        <w:tc>
+          <w:tcPr>
+            <w:tcW w:type="dxa" w:w="1200"/>
+            <w:tcBorders>
+              <w:top w:val="none" w:color="FFFFFF" w:sz="0"/>
+              <w:left w:val="none" w:color="FFFFFF" w:sz="0"/>
+              <w:bottom w:val="none" w:color="FFFFFF" w:sz="0"/>
+              <w:right w:val="none" w:color="FFFFFF" w:sz="0"/>
+            </w:tcBorders>
+            <w:tcMar>
+              <w:top w:type="dxa" w:w="20"/>
+              <w:left w:type="dxa" w:w="80"/>
+              <w:bottom w:type="dxa" w:w="20"/>
+              <w:right w:type="dxa" w:w="80"/>
+            </w:tcMar>
+          </w:tcPr>
+          <w:p>
+            <w:pPr>
+              <w:spacing w:after="20" w:before="20" w:line="240"/>
+              <w:jc w:val="center"/>
+            </w:pPr>
+            <w:r>
+              <w:rPr>
+                <w:rFonts w:ascii="Times New Roman" w:cs="Times New Roman" w:eastAsia="Times New Roman" w:hAnsi="Times New Roman"/>
+                <w:b w:val="false"/>
+                <w:bCs w:val="false"/>
+                <w:i w:val="false"/>
+                <w:iCs w:val="false"/>
+                <w:sz w:val="24"/>
+                <w:szCs w:val="24"/>
+              </w:rPr>
+              <w:t xml:space="preserve">24.70</w:t>
+            </w:r>
+          </w:p>
+        </w:tc>
+        <w:tc>
+          <w:tcPr>
+            <w:tcW w:type="dxa" w:w="1200"/>
+            <w:tcBorders>
+              <w:top w:val="none" w:color="FFFFFF" w:sz="0"/>
+              <w:left w:val="none" w:color="FFFFFF" w:sz="0"/>
+              <w:bottom w:val="none" w:color="FFFFFF" w:sz="0"/>
+              <w:right w:val="none" w:color="FFFFFF" w:sz="0"/>
+            </w:tcBorders>
+            <w:tcMar>
+              <w:top w:type="dxa" w:w="20"/>
+              <w:left w:type="dxa" w:w="80"/>
+              <w:bottom w:type="dxa" w:w="20"/>
+              <w:right w:type="dxa" w:w="80"/>
+            </w:tcMar>
+          </w:tcPr>
+          <w:p>
+            <w:pPr>
+              <w:spacing w:after="20" w:before="20" w:line="240"/>
+              <w:jc w:val="center"/>
+            </w:pPr>
+            <w:r>
+              <w:rPr>
+                <w:rFonts w:ascii="Times New Roman" w:cs="Times New Roman" w:eastAsia="Times New Roman" w:hAnsi="Times New Roman"/>
+                <w:b w:val="false"/>
+                <w:bCs w:val="false"/>
+                <w:i w:val="false"/>
+                <w:iCs w:val="false"/>
+                <w:sz w:val="24"/>
+                <w:szCs w:val="24"/>
+              </w:rPr>
+              <w:t xml:space="preserve">28.20</w:t>
+            </w:r>
+          </w:p>
+        </w:tc>
+      </w:tr>
+      <w:tr>
+        <w:tc>
+          <w:tcPr>
+            <w:tcW w:type="dxa" w:w="3360"/>
+            <w:tcBorders>
+              <w:top w:val="none" w:color="FFFFFF" w:sz="0"/>
+              <w:left w:val="none" w:color="FFFFFF" w:sz="0"/>
+              <w:bottom w:val="none" w:color="FFFFFF" w:sz="0"/>
+              <w:right w:val="none" w:color="FFFFFF" w:sz="0"/>
+            </w:tcBorders>
+            <w:tcMar>
+              <w:top w:type="dxa" w:w="20"/>
+              <w:left w:type="dxa" w:w="80"/>
+              <w:bottom w:type="dxa" w:w="20"/>
+              <w:right w:type="dxa" w:w="80"/>
+            </w:tcMar>
+          </w:tcPr>
+          <w:p>
+            <w:pPr>
+              <w:spacing w:after="20" w:before="20" w:line="240"/>
+              <w:jc w:val="left"/>
+            </w:pPr>
+            <w:r>
+              <w:rPr>
+                <w:rFonts w:ascii="Times New Roman" w:cs="Times New Roman" w:eastAsia="Times New Roman" w:hAnsi="Times New Roman"/>
+                <w:b w:val="false"/>
+                <w:bCs w:val="false"/>
+                <w:i w:val="false"/>
+                <w:iCs w:val="false"/>
+                <w:sz w:val="24"/>
+                <w:szCs w:val="24"/>
+              </w:rPr>
+              <w:t xml:space="preserve">Annual precipitation (mm)</w:t>
+            </w:r>
+          </w:p>
+        </w:tc>
+        <w:tc>
+          <w:tcPr>
+            <w:tcW w:type="dxa" w:w="1300"/>
+            <w:tcBorders>
+              <w:top w:val="none" w:color="FFFFFF" w:sz="0"/>
+              <w:left w:val="none" w:color="FFFFFF" w:sz="0"/>
+              <w:bottom w:val="none" w:color="FFFFFF" w:sz="0"/>
+              <w:right w:val="none" w:color="FFFFFF" w:sz="0"/>
+            </w:tcBorders>
+            <w:tcMar>
+              <w:top w:type="dxa" w:w="20"/>
+              <w:left w:type="dxa" w:w="80"/>
+              <w:bottom w:type="dxa" w:w="20"/>
+              <w:right w:type="dxa" w:w="80"/>
+            </w:tcMar>
+          </w:tcPr>
+          <w:p>
+            <w:pPr>
+              <w:spacing w:after="20" w:before="20" w:line="240"/>
+              <w:jc w:val="center"/>
+            </w:pPr>
+            <w:r>
+              <w:rPr>
+                <w:rFonts w:ascii="Times New Roman" w:cs="Times New Roman" w:eastAsia="Times New Roman" w:hAnsi="Times New Roman"/>
+                <w:b w:val="false"/>
+                <w:bCs w:val="false"/>
+                <w:i w:val="false"/>
+                <w:iCs w:val="false"/>
+                <w:sz w:val="24"/>
+                <w:szCs w:val="24"/>
+              </w:rPr>
+              <w:t xml:space="preserve">1,434.10</w:t>
+            </w:r>
+          </w:p>
+        </w:tc>
+        <w:tc>
+          <w:tcPr>
+            <w:tcW w:type="dxa" w:w="1150"/>
+            <w:tcBorders>
+              <w:top w:val="none" w:color="FFFFFF" w:sz="0"/>
+              <w:left w:val="none" w:color="FFFFFF" w:sz="0"/>
+              <w:bottom w:val="none" w:color="FFFFFF" w:sz="0"/>
+              <w:right w:val="none" w:color="FFFFFF" w:sz="0"/>
+            </w:tcBorders>
+            <w:tcMar>
+              <w:top w:type="dxa" w:w="20"/>
+              <w:left w:type="dxa" w:w="80"/>
+              <w:bottom w:type="dxa" w:w="20"/>
+              <w:right w:type="dxa" w:w="80"/>
+            </w:tcMar>
+          </w:tcPr>
+          <w:p>
+            <w:pPr>
+              <w:spacing w:after="20" w:before="20" w:line="240"/>
+              <w:jc w:val="center"/>
+            </w:pPr>
+            <w:r>
+              <w:rPr>
+                <w:rFonts w:ascii="Times New Roman" w:cs="Times New Roman" w:eastAsia="Times New Roman" w:hAnsi="Times New Roman"/>
+                <w:b w:val="false"/>
+                <w:bCs w:val="false"/>
+                <w:i w:val="false"/>
+                <w:iCs w:val="false"/>
+                <w:sz w:val="24"/>
+                <w:szCs w:val="24"/>
+              </w:rPr>
+              <w:t xml:space="preserve">656.60</w:t>
+            </w:r>
+          </w:p>
+        </w:tc>
+        <w:tc>
+          <w:tcPr>
+            <w:tcW w:type="dxa" w:w="1150"/>
+            <w:tcBorders>
+              <w:top w:val="none" w:color="FFFFFF" w:sz="0"/>
+              <w:left w:val="none" w:color="FFFFFF" w:sz="0"/>
+              <w:bottom w:val="none" w:color="FFFFFF" w:sz="0"/>
+              <w:right w:val="none" w:color="FFFFFF" w:sz="0"/>
+            </w:tcBorders>
+            <w:tcMar>
+              <w:top w:type="dxa" w:w="20"/>
+              <w:left w:type="dxa" w:w="80"/>
+              <w:bottom w:type="dxa" w:w="20"/>
+              <w:right w:type="dxa" w:w="80"/>
+            </w:tcMar>
+          </w:tcPr>
+          <w:p>
+            <w:pPr>
+              <w:spacing w:after="20" w:before="20" w:line="240"/>
+              <w:jc w:val="center"/>
+            </w:pPr>
+            <w:r>
+              <w:rPr>
+                <w:rFonts w:ascii="Times New Roman" w:cs="Times New Roman" w:eastAsia="Times New Roman" w:hAnsi="Times New Roman"/>
+                <w:b w:val="false"/>
+                <w:bCs w:val="false"/>
+                <w:i w:val="false"/>
+                <w:iCs w:val="false"/>
+                <w:sz w:val="24"/>
+                <w:szCs w:val="24"/>
+              </w:rPr>
+              <w:t xml:space="preserve">1,326.70</w:t>
+            </w:r>
+          </w:p>
+        </w:tc>
+        <w:tc>
+          <w:tcPr>
+            <w:tcW w:type="dxa" w:w="1200"/>
+            <w:tcBorders>
+              <w:top w:val="none" w:color="FFFFFF" w:sz="0"/>
+              <w:left w:val="none" w:color="FFFFFF" w:sz="0"/>
+              <w:bottom w:val="none" w:color="FFFFFF" w:sz="0"/>
+              <w:right w:val="none" w:color="FFFFFF" w:sz="0"/>
+            </w:tcBorders>
+            <w:tcMar>
+              <w:top w:type="dxa" w:w="20"/>
+              <w:left w:type="dxa" w:w="80"/>
+              <w:bottom w:type="dxa" w:w="20"/>
+              <w:right w:type="dxa" w:w="80"/>
+            </w:tcMar>
+          </w:tcPr>
+          <w:p>
+            <w:pPr>
+              <w:spacing w:after="20" w:before="20" w:line="240"/>
+              <w:jc w:val="center"/>
+            </w:pPr>
+            <w:r>
+              <w:rPr>
+                <w:rFonts w:ascii="Times New Roman" w:cs="Times New Roman" w:eastAsia="Times New Roman" w:hAnsi="Times New Roman"/>
+                <w:b w:val="false"/>
+                <w:bCs w:val="false"/>
+                <w:i w:val="false"/>
+                <w:iCs w:val="false"/>
+                <w:sz w:val="24"/>
+                <w:szCs w:val="24"/>
+              </w:rPr>
+              <w:t xml:space="preserve">488.40</w:t>
+            </w:r>
+          </w:p>
+        </w:tc>
+        <w:tc>
+          <w:tcPr>
+            <w:tcW w:type="dxa" w:w="1200"/>
+            <w:tcBorders>
+              <w:top w:val="none" w:color="FFFFFF" w:sz="0"/>
+              <w:left w:val="none" w:color="FFFFFF" w:sz="0"/>
+              <w:bottom w:val="none" w:color="FFFFFF" w:sz="0"/>
+              <w:right w:val="none" w:color="FFFFFF" w:sz="0"/>
+            </w:tcBorders>
+            <w:tcMar>
+              <w:top w:type="dxa" w:w="20"/>
+              <w:left w:type="dxa" w:w="80"/>
+              <w:bottom w:type="dxa" w:w="20"/>
+              <w:right w:type="dxa" w:w="80"/>
+            </w:tcMar>
+          </w:tcPr>
+          <w:p>
+            <w:pPr>
+              <w:spacing w:after="20" w:before="20" w:line="240"/>
+              <w:jc w:val="center"/>
+            </w:pPr>
+            <w:r>
+              <w:rPr>
+                <w:rFonts w:ascii="Times New Roman" w:cs="Times New Roman" w:eastAsia="Times New Roman" w:hAnsi="Times New Roman"/>
+                <w:b w:val="false"/>
+                <w:bCs w:val="false"/>
+                <w:i w:val="false"/>
+                <w:iCs w:val="false"/>
+                <w:sz w:val="24"/>
+                <w:szCs w:val="24"/>
+              </w:rPr>
+              <w:t xml:space="preserve">3,114.80</w:t>
+            </w:r>
+          </w:p>
+        </w:tc>
+      </w:tr>
+      <w:tr>
+        <w:tc>
+          <w:tcPr>
+            <w:tcW w:type="dxa" w:w="3360"/>
+            <w:tcBorders>
+              <w:top w:val="none" w:color="FFFFFF" w:sz="0"/>
+              <w:left w:val="none" w:color="FFFFFF" w:sz="0"/>
+              <w:bottom w:val="none" w:color="FFFFFF" w:sz="0"/>
+              <w:right w:val="none" w:color="FFFFFF" w:sz="0"/>
+            </w:tcBorders>
+            <w:tcMar>
+              <w:top w:type="dxa" w:w="20"/>
+              <w:left w:type="dxa" w:w="80"/>
+              <w:bottom w:type="dxa" w:w="20"/>
+              <w:right w:type="dxa" w:w="80"/>
+            </w:tcMar>
+          </w:tcPr>
+          <w:p>
+            <w:pPr>
+              <w:spacing w:after="20" w:before="20" w:line="240"/>
+              <w:jc w:val="left"/>
+            </w:pPr>
+            <w:r>
+              <w:rPr>
+                <w:rFonts w:ascii="Times New Roman" w:cs="Times New Roman" w:eastAsia="Times New Roman" w:hAnsi="Times New Roman"/>
+                <w:b w:val="false"/>
+                <w:bCs w:val="false"/>
+                <w:i w:val="false"/>
+                <w:iCs w:val="false"/>
+                <w:sz w:val="24"/>
+                <w:szCs w:val="24"/>
+              </w:rPr>
+              <w:t xml:space="preserve">Precipitation seasonality (CV)</w:t>
+            </w:r>
+          </w:p>
+        </w:tc>
+        <w:tc>
+          <w:tcPr>
+            <w:tcW w:type="dxa" w:w="1300"/>
+            <w:tcBorders>
+              <w:top w:val="none" w:color="FFFFFF" w:sz="0"/>
+              <w:left w:val="none" w:color="FFFFFF" w:sz="0"/>
+              <w:bottom w:val="none" w:color="FFFFFF" w:sz="0"/>
+              <w:right w:val="none" w:color="FFFFFF" w:sz="0"/>
+            </w:tcBorders>
+            <w:tcMar>
+              <w:top w:type="dxa" w:w="20"/>
+              <w:left w:type="dxa" w:w="80"/>
+              <w:bottom w:type="dxa" w:w="20"/>
+              <w:right w:type="dxa" w:w="80"/>
+            </w:tcMar>
+          </w:tcPr>
+          <w:p>
+            <w:pPr>
+              <w:spacing w:after="20" w:before="20" w:line="240"/>
+              <w:jc w:val="center"/>
+            </w:pPr>
+            <w:r>
+              <w:rPr>
+                <w:rFonts w:ascii="Times New Roman" w:cs="Times New Roman" w:eastAsia="Times New Roman" w:hAnsi="Times New Roman"/>
+                <w:b w:val="false"/>
+                <w:bCs w:val="false"/>
+                <w:i w:val="false"/>
+                <w:iCs w:val="false"/>
+                <w:sz w:val="24"/>
+                <w:szCs w:val="24"/>
+              </w:rPr>
+              <w:t xml:space="preserve">92.50</w:t>
+            </w:r>
+          </w:p>
+        </w:tc>
+        <w:tc>
+          <w:tcPr>
+            <w:tcW w:type="dxa" w:w="1150"/>
+            <w:tcBorders>
+              <w:top w:val="none" w:color="FFFFFF" w:sz="0"/>
+              <w:left w:val="none" w:color="FFFFFF" w:sz="0"/>
+              <w:bottom w:val="none" w:color="FFFFFF" w:sz="0"/>
+              <w:right w:val="none" w:color="FFFFFF" w:sz="0"/>
+            </w:tcBorders>
+            <w:tcMar>
+              <w:top w:type="dxa" w:w="20"/>
+              <w:left w:type="dxa" w:w="80"/>
+              <w:bottom w:type="dxa" w:w="20"/>
+              <w:right w:type="dxa" w:w="80"/>
+            </w:tcMar>
+          </w:tcPr>
+          <w:p>
+            <w:pPr>
+              <w:spacing w:after="20" w:before="20" w:line="240"/>
+              <w:jc w:val="center"/>
+            </w:pPr>
+            <w:r>
+              <w:rPr>
+                <w:rFonts w:ascii="Times New Roman" w:cs="Times New Roman" w:eastAsia="Times New Roman" w:hAnsi="Times New Roman"/>
+                <w:b w:val="false"/>
+                <w:bCs w:val="false"/>
+                <w:i w:val="false"/>
+                <w:iCs w:val="false"/>
+                <w:sz w:val="24"/>
+                <w:szCs w:val="24"/>
+              </w:rPr>
+              <w:t xml:space="preserve">27.30</w:t>
+            </w:r>
+          </w:p>
+        </w:tc>
+        <w:tc>
+          <w:tcPr>
+            <w:tcW w:type="dxa" w:w="1150"/>
+            <w:tcBorders>
+              <w:top w:val="none" w:color="FFFFFF" w:sz="0"/>
+              <w:left w:val="none" w:color="FFFFFF" w:sz="0"/>
+              <w:bottom w:val="none" w:color="FFFFFF" w:sz="0"/>
+              <w:right w:val="none" w:color="FFFFFF" w:sz="0"/>
+            </w:tcBorders>
+            <w:tcMar>
+              <w:top w:type="dxa" w:w="20"/>
+              <w:left w:type="dxa" w:w="80"/>
+              <w:bottom w:type="dxa" w:w="20"/>
+              <w:right w:type="dxa" w:w="80"/>
+            </w:tcMar>
+          </w:tcPr>
+          <w:p>
+            <w:pPr>
+              <w:spacing w:after="20" w:before="20" w:line="240"/>
+              <w:jc w:val="center"/>
+            </w:pPr>
+            <w:r>
+              <w:rPr>
+                <w:rFonts w:ascii="Times New Roman" w:cs="Times New Roman" w:eastAsia="Times New Roman" w:hAnsi="Times New Roman"/>
+                <w:b w:val="false"/>
+                <w:bCs w:val="false"/>
+                <w:i w:val="false"/>
+                <w:iCs w:val="false"/>
+                <w:sz w:val="24"/>
+                <w:szCs w:val="24"/>
+              </w:rPr>
+              <w:t xml:space="preserve">82.60</w:t>
+            </w:r>
+          </w:p>
+        </w:tc>
+        <w:tc>
+          <w:tcPr>
+            <w:tcW w:type="dxa" w:w="1200"/>
+            <w:tcBorders>
+              <w:top w:val="none" w:color="FFFFFF" w:sz="0"/>
+              <w:left w:val="none" w:color="FFFFFF" w:sz="0"/>
+              <w:bottom w:val="none" w:color="FFFFFF" w:sz="0"/>
+              <w:right w:val="none" w:color="FFFFFF" w:sz="0"/>
+            </w:tcBorders>
+            <w:tcMar>
+              <w:top w:type="dxa" w:w="20"/>
+              <w:left w:type="dxa" w:w="80"/>
+              <w:bottom w:type="dxa" w:w="20"/>
+              <w:right w:type="dxa" w:w="80"/>
+            </w:tcMar>
+          </w:tcPr>
+          <w:p>
+            <w:pPr>
+              <w:spacing w:after="20" w:before="20" w:line="240"/>
+              <w:jc w:val="center"/>
+            </w:pPr>
+            <w:r>
+              <w:rPr>
+                <w:rFonts w:ascii="Times New Roman" w:cs="Times New Roman" w:eastAsia="Times New Roman" w:hAnsi="Times New Roman"/>
+                <w:b w:val="false"/>
+                <w:bCs w:val="false"/>
+                <w:i w:val="false"/>
+                <w:iCs w:val="false"/>
+                <w:sz w:val="24"/>
+                <w:szCs w:val="24"/>
+              </w:rPr>
+              <w:t xml:space="preserve">63.10</w:t>
+            </w:r>
+          </w:p>
+        </w:tc>
+        <w:tc>
+          <w:tcPr>
+            <w:tcW w:type="dxa" w:w="1200"/>
+            <w:tcBorders>
+              <w:top w:val="none" w:color="FFFFFF" w:sz="0"/>
+              <w:left w:val="none" w:color="FFFFFF" w:sz="0"/>
+              <w:bottom w:val="none" w:color="FFFFFF" w:sz="0"/>
+              <w:right w:val="none" w:color="FFFFFF" w:sz="0"/>
+            </w:tcBorders>
+            <w:tcMar>
+              <w:top w:type="dxa" w:w="20"/>
+              <w:left w:type="dxa" w:w="80"/>
+              <w:bottom w:type="dxa" w:w="20"/>
+              <w:right w:type="dxa" w:w="80"/>
+            </w:tcMar>
+          </w:tcPr>
+          <w:p>
+            <w:pPr>
+              <w:spacing w:after="20" w:before="20" w:line="240"/>
+              <w:jc w:val="center"/>
+            </w:pPr>
+            <w:r>
+              <w:rPr>
+                <w:rFonts w:ascii="Times New Roman" w:cs="Times New Roman" w:eastAsia="Times New Roman" w:hAnsi="Times New Roman"/>
+                <w:b w:val="false"/>
+                <w:bCs w:val="false"/>
+                <w:i w:val="false"/>
+                <w:iCs w:val="false"/>
+                <w:sz w:val="24"/>
+                <w:szCs w:val="24"/>
+              </w:rPr>
+              <w:t xml:space="preserve">148.30</w:t>
+            </w:r>
+          </w:p>
+        </w:tc>
+      </w:tr>
+      <w:tr>
+        <w:tc>
+          <w:tcPr>
+            <w:tcW w:type="dxa" w:w="3360"/>
+            <w:tcBorders>
+              <w:top w:val="none" w:color="FFFFFF" w:sz="0"/>
+              <w:left w:val="none" w:color="FFFFFF" w:sz="0"/>
+              <w:bottom w:val="none" w:color="FFFFFF" w:sz="0"/>
+              <w:right w:val="none" w:color="FFFFFF" w:sz="0"/>
+            </w:tcBorders>
+            <w:tcMar>
+              <w:top w:type="dxa" w:w="20"/>
+              <w:left w:type="dxa" w:w="80"/>
+              <w:bottom w:type="dxa" w:w="20"/>
+              <w:right w:type="dxa" w:w="80"/>
+            </w:tcMar>
+          </w:tcPr>
+          <w:p>
+            <w:pPr>
+              <w:spacing w:after="20" w:before="20" w:line="240"/>
+              <w:jc w:val="left"/>
+            </w:pPr>
+            <w:r>
+              <w:rPr>
+                <w:rFonts w:ascii="Times New Roman" w:cs="Times New Roman" w:eastAsia="Times New Roman" w:hAnsi="Times New Roman"/>
+                <w:b w:val="false"/>
+                <w:bCs w:val="false"/>
+                <w:i w:val="false"/>
+                <w:iCs w:val="false"/>
+                <w:sz w:val="24"/>
+                <w:szCs w:val="24"/>
+              </w:rPr>
+              <w:t xml:space="preserve">Temperature seasonality (SD ×100)</w:t>
+            </w:r>
+          </w:p>
+        </w:tc>
+        <w:tc>
+          <w:tcPr>
+            <w:tcW w:type="dxa" w:w="1300"/>
+            <w:tcBorders>
+              <w:top w:val="none" w:color="FFFFFF" w:sz="0"/>
+              <w:left w:val="none" w:color="FFFFFF" w:sz="0"/>
+              <w:bottom w:val="none" w:color="FFFFFF" w:sz="0"/>
+              <w:right w:val="none" w:color="FFFFFF" w:sz="0"/>
+            </w:tcBorders>
+            <w:tcMar>
+              <w:top w:type="dxa" w:w="20"/>
+              <w:left w:type="dxa" w:w="80"/>
+              <w:bottom w:type="dxa" w:w="20"/>
+              <w:right w:type="dxa" w:w="80"/>
+            </w:tcMar>
+          </w:tcPr>
+          <w:p>
+            <w:pPr>
+              <w:spacing w:after="20" w:before="20" w:line="240"/>
+              <w:jc w:val="center"/>
+            </w:pPr>
+            <w:r>
+              <w:rPr>
+                <w:rFonts w:ascii="Times New Roman" w:cs="Times New Roman" w:eastAsia="Times New Roman" w:hAnsi="Times New Roman"/>
+                <w:b w:val="false"/>
+                <w:bCs w:val="false"/>
+                <w:i w:val="false"/>
+                <w:iCs w:val="false"/>
+                <w:sz w:val="24"/>
+                <w:szCs w:val="24"/>
+              </w:rPr>
+              <w:t xml:space="preserve">173.70</w:t>
+            </w:r>
+          </w:p>
+        </w:tc>
+        <w:tc>
+          <w:tcPr>
+            <w:tcW w:type="dxa" w:w="1150"/>
+            <w:tcBorders>
+              <w:top w:val="none" w:color="FFFFFF" w:sz="0"/>
+              <w:left w:val="none" w:color="FFFFFF" w:sz="0"/>
+              <w:bottom w:val="none" w:color="FFFFFF" w:sz="0"/>
+              <w:right w:val="none" w:color="FFFFFF" w:sz="0"/>
+            </w:tcBorders>
+            <w:tcMar>
+              <w:top w:type="dxa" w:w="20"/>
+              <w:left w:type="dxa" w:w="80"/>
+              <w:bottom w:type="dxa" w:w="20"/>
+              <w:right w:type="dxa" w:w="80"/>
+            </w:tcMar>
+          </w:tcPr>
+          <w:p>
+            <w:pPr>
+              <w:spacing w:after="20" w:before="20" w:line="240"/>
+              <w:jc w:val="center"/>
+            </w:pPr>
+            <w:r>
+              <w:rPr>
+                <w:rFonts w:ascii="Times New Roman" w:cs="Times New Roman" w:eastAsia="Times New Roman" w:hAnsi="Times New Roman"/>
+                <w:b w:val="false"/>
+                <w:bCs w:val="false"/>
+                <w:i w:val="false"/>
+                <w:iCs w:val="false"/>
+                <w:sz w:val="24"/>
+                <w:szCs w:val="24"/>
+              </w:rPr>
+              <w:t xml:space="preserve">72.30</w:t>
+            </w:r>
+          </w:p>
+        </w:tc>
+        <w:tc>
+          <w:tcPr>
+            <w:tcW w:type="dxa" w:w="1150"/>
+            <w:tcBorders>
+              <w:top w:val="none" w:color="FFFFFF" w:sz="0"/>
+              <w:left w:val="none" w:color="FFFFFF" w:sz="0"/>
+              <w:bottom w:val="none" w:color="FFFFFF" w:sz="0"/>
+              <w:right w:val="none" w:color="FFFFFF" w:sz="0"/>
+            </w:tcBorders>
+            <w:tcMar>
+              <w:top w:type="dxa" w:w="20"/>
+              <w:left w:type="dxa" w:w="80"/>
+              <w:bottom w:type="dxa" w:w="20"/>
+              <w:right w:type="dxa" w:w="80"/>
+            </w:tcMar>
+          </w:tcPr>
+          <w:p>
+            <w:pPr>
+              <w:spacing w:after="20" w:before="20" w:line="240"/>
+              <w:jc w:val="center"/>
+            </w:pPr>
+            <w:r>
+              <w:rPr>
+                <w:rFonts w:ascii="Times New Roman" w:cs="Times New Roman" w:eastAsia="Times New Roman" w:hAnsi="Times New Roman"/>
+                <w:b w:val="false"/>
+                <w:bCs w:val="false"/>
+                <w:i w:val="false"/>
+                <w:iCs w:val="false"/>
+                <w:sz w:val="24"/>
+                <w:szCs w:val="24"/>
+              </w:rPr>
+              <w:t xml:space="preserve">151.50</w:t>
+            </w:r>
+          </w:p>
+        </w:tc>
+        <w:tc>
+          <w:tcPr>
+            <w:tcW w:type="dxa" w:w="1200"/>
+            <w:tcBorders>
+              <w:top w:val="none" w:color="FFFFFF" w:sz="0"/>
+              <w:left w:val="none" w:color="FFFFFF" w:sz="0"/>
+              <w:bottom w:val="none" w:color="FFFFFF" w:sz="0"/>
+              <w:right w:val="none" w:color="FFFFFF" w:sz="0"/>
+            </w:tcBorders>
+            <w:tcMar>
+              <w:top w:type="dxa" w:w="20"/>
+              <w:left w:type="dxa" w:w="80"/>
+              <w:bottom w:type="dxa" w:w="20"/>
+              <w:right w:type="dxa" w:w="80"/>
+            </w:tcMar>
+          </w:tcPr>
+          <w:p>
+            <w:pPr>
+              <w:spacing w:after="20" w:before="20" w:line="240"/>
+              <w:jc w:val="center"/>
+            </w:pPr>
+            <w:r>
+              <w:rPr>
+                <w:rFonts w:ascii="Times New Roman" w:cs="Times New Roman" w:eastAsia="Times New Roman" w:hAnsi="Times New Roman"/>
+                <w:b w:val="false"/>
+                <w:bCs w:val="false"/>
+                <w:i w:val="false"/>
+                <w:iCs w:val="false"/>
+                <w:sz w:val="24"/>
+                <w:szCs w:val="24"/>
+              </w:rPr>
+              <w:t xml:space="preserve">88.80</w:t>
+            </w:r>
+          </w:p>
+        </w:tc>
+        <w:tc>
+          <w:tcPr>
+            <w:tcW w:type="dxa" w:w="1200"/>
+            <w:tcBorders>
+              <w:top w:val="none" w:color="FFFFFF" w:sz="0"/>
+              <w:left w:val="none" w:color="FFFFFF" w:sz="0"/>
+              <w:bottom w:val="none" w:color="FFFFFF" w:sz="0"/>
+              <w:right w:val="none" w:color="FFFFFF" w:sz="0"/>
+            </w:tcBorders>
+            <w:tcMar>
+              <w:top w:type="dxa" w:w="20"/>
+              <w:left w:type="dxa" w:w="80"/>
+              <w:bottom w:type="dxa" w:w="20"/>
+              <w:right w:type="dxa" w:w="80"/>
+            </w:tcMar>
+          </w:tcPr>
+          <w:p>
+            <w:pPr>
+              <w:spacing w:after="20" w:before="20" w:line="240"/>
+              <w:jc w:val="center"/>
+            </w:pPr>
+            <w:r>
+              <w:rPr>
+                <w:rFonts w:ascii="Times New Roman" w:cs="Times New Roman" w:eastAsia="Times New Roman" w:hAnsi="Times New Roman"/>
+                <w:b w:val="false"/>
+                <w:bCs w:val="false"/>
+                <w:i w:val="false"/>
+                <w:iCs w:val="false"/>
+                <w:sz w:val="24"/>
+                <w:szCs w:val="24"/>
+              </w:rPr>
+              <w:t xml:space="preserve">320.90</w:t>
+            </w:r>
+          </w:p>
+        </w:tc>
+      </w:tr>
     </w:tbl>
     <w:p>
       <w:pPr>
@@ -4501,7 +5568,7 @@
           <w:sz w:val="24"/>
           <w:szCs w:val="24"/>
         </w:rPr>
-        <w:t xml:space="preserve"> Burden figures are cumulative over epidemiological week 6 of 2020 to week 34 of 2026 (Nigeria Centre for Disease Control weekly situation reports). Population and density from WorldPop bottom-up estimates (v2.0); poverty from the Oxford Poverty and Human Development Initiative subnational Multidimensional Poverty Index (MICS 2021); health facilities from the Humanitarian Data Exchange national registry; reservoir occurrences from the Global Biodiversity Information Facility. The case-fatality rate row summarizes state-level ratios; the population-weighted national rate was 16.10%.</w:t>
+        <w:t xml:space="preserve"> Burden figures are cumulative over epidemiological week 6 of 2020 to week 34 of 2026 (Nigeria Centre for Disease Control weekly situation reports). Population and density from WorldPop bottom-up estimates (v2.0); poverty from the Oxford Poverty and Human Development Initiative subnational Multidimensional Poverty Index (MICS 2021); health facilities from the Humanitarian Data Exchange national registry; reservoir occurrences from the Global Biodiversity Information Facility; climate from WorldClim 2.1 (1970–2000 normals, 5-arc-minute zonal means). The case-fatality rate row summarizes state-level ratios; the population-weighted national rate was 16.10%.</w:t>
       </w:r>
     </w:p>
     <w:p>
@@ -5860,6 +6927,691 @@
           <w:szCs w:val="24"/>
         </w:rPr>
         <w:t xml:space="preserve"> &lt; .001.</w:t>
+      </w:r>
+    </w:p>
+    <w:p>
+      <w:pPr>
+        <w:spacing w:before="240" w:line="480"/>
+      </w:pPr>
+      <w:r>
+        <w:rPr>
+          <w:rFonts w:ascii="Times New Roman" w:cs="Times New Roman" w:eastAsia="Times New Roman" w:hAnsi="Times New Roman"/>
+          <w:b/>
+          <w:bCs/>
+          <w:sz w:val="24"/>
+          <w:szCs w:val="24"/>
+        </w:rPr>
+        <w:t xml:space="preserve">Table 3</w:t>
+      </w:r>
+    </w:p>
+    <w:p>
+      <w:pPr>
+        <w:spacing w:line="480"/>
+      </w:pPr>
+      <w:r>
+        <w:rPr>
+          <w:rFonts w:ascii="Times New Roman" w:cs="Times New Roman" w:eastAsia="Times New Roman" w:hAnsi="Times New Roman"/>
+          <w:i/>
+          <w:iCs/>
+          <w:sz w:val="24"/>
+          <w:szCs w:val="24"/>
+        </w:rPr>
+        <w:t xml:space="preserve">Parsimonious Low-Collinearity Negative Binomial Model of State Lassa Fever Incidence (N = 37)</w:t>
+      </w:r>
+    </w:p>
+    <w:tbl>
+      <w:tblPr>
+        <w:tblW w:type="dxa" w:w="9360"/>
+        <w:tblBorders>
+          <w:top w:val="single" w:color="000000" w:sz="4"/>
+          <w:left w:val="none" w:color="FFFFFF" w:sz="0"/>
+          <w:bottom w:val="single" w:color="000000" w:sz="4"/>
+          <w:right w:val="none" w:color="FFFFFF" w:sz="0"/>
+          <w:insideH w:val="none" w:color="FFFFFF" w:sz="0"/>
+          <w:insideV w:val="none" w:color="FFFFFF" w:sz="0"/>
+        </w:tblBorders>
+      </w:tblPr>
+      <w:tblGrid>
+        <w:gridCol w:w="4060"/>
+        <w:gridCol w:w="1400"/>
+        <w:gridCol w:w="2500"/>
+        <w:gridCol w:w="1400"/>
+      </w:tblGrid>
+      <w:tr>
+        <w:trPr>
+          <w:tblHeader/>
+        </w:trPr>
+        <w:tc>
+          <w:tcPr>
+            <w:tcW w:type="dxa" w:w="4060"/>
+            <w:tcBorders>
+              <w:top w:val="none" w:color="FFFFFF" w:sz="0"/>
+              <w:left w:val="none" w:color="FFFFFF" w:sz="0"/>
+              <w:bottom w:val="single" w:color="000000" w:sz="4"/>
+              <w:right w:val="none" w:color="FFFFFF" w:sz="0"/>
+            </w:tcBorders>
+            <w:tcMar>
+              <w:top w:type="dxa" w:w="20"/>
+              <w:left w:type="dxa" w:w="80"/>
+              <w:bottom w:type="dxa" w:w="20"/>
+              <w:right w:type="dxa" w:w="80"/>
+            </w:tcMar>
+          </w:tcPr>
+          <w:p>
+            <w:pPr>
+              <w:spacing w:after="20" w:before="20" w:line="240"/>
+              <w:jc w:val="left"/>
+            </w:pPr>
+            <w:r>
+              <w:rPr>
+                <w:rFonts w:ascii="Times New Roman" w:cs="Times New Roman" w:eastAsia="Times New Roman" w:hAnsi="Times New Roman"/>
+                <w:b w:val="false"/>
+                <w:bCs w:val="false"/>
+                <w:i w:val="false"/>
+                <w:iCs w:val="false"/>
+                <w:sz w:val="24"/>
+                <w:szCs w:val="24"/>
+              </w:rPr>
+              <w:t xml:space="preserve">Predictor (per 1 SD)</w:t>
+            </w:r>
+          </w:p>
+        </w:tc>
+        <w:tc>
+          <w:tcPr>
+            <w:tcW w:type="dxa" w:w="1400"/>
+            <w:tcBorders>
+              <w:top w:val="none" w:color="FFFFFF" w:sz="0"/>
+              <w:left w:val="none" w:color="FFFFFF" w:sz="0"/>
+              <w:bottom w:val="single" w:color="000000" w:sz="4"/>
+              <w:right w:val="none" w:color="FFFFFF" w:sz="0"/>
+            </w:tcBorders>
+            <w:tcMar>
+              <w:top w:type="dxa" w:w="20"/>
+              <w:left w:type="dxa" w:w="80"/>
+              <w:bottom w:type="dxa" w:w="20"/>
+              <w:right w:type="dxa" w:w="80"/>
+            </w:tcMar>
+          </w:tcPr>
+          <w:p>
+            <w:pPr>
+              <w:spacing w:after="20" w:before="20" w:line="240"/>
+              <w:jc w:val="center"/>
+            </w:pPr>
+            <w:r>
+              <w:rPr>
+                <w:rFonts w:ascii="Times New Roman" w:cs="Times New Roman" w:eastAsia="Times New Roman" w:hAnsi="Times New Roman"/>
+                <w:b w:val="false"/>
+                <w:bCs w:val="false"/>
+                <w:i/>
+                <w:iCs/>
+                <w:sz w:val="24"/>
+                <w:szCs w:val="24"/>
+              </w:rPr>
+              <w:t xml:space="preserve">IRR</w:t>
+            </w:r>
+          </w:p>
+        </w:tc>
+        <w:tc>
+          <w:tcPr>
+            <w:tcW w:type="dxa" w:w="2500"/>
+            <w:tcBorders>
+              <w:top w:val="none" w:color="FFFFFF" w:sz="0"/>
+              <w:left w:val="none" w:color="FFFFFF" w:sz="0"/>
+              <w:bottom w:val="single" w:color="000000" w:sz="4"/>
+              <w:right w:val="none" w:color="FFFFFF" w:sz="0"/>
+            </w:tcBorders>
+            <w:tcMar>
+              <w:top w:type="dxa" w:w="20"/>
+              <w:left w:type="dxa" w:w="80"/>
+              <w:bottom w:type="dxa" w:w="20"/>
+              <w:right w:type="dxa" w:w="80"/>
+            </w:tcMar>
+          </w:tcPr>
+          <w:p>
+            <w:pPr>
+              <w:spacing w:after="20" w:before="20" w:line="240"/>
+              <w:jc w:val="center"/>
+            </w:pPr>
+            <w:r>
+              <w:rPr>
+                <w:rFonts w:ascii="Times New Roman" w:cs="Times New Roman" w:eastAsia="Times New Roman" w:hAnsi="Times New Roman"/>
+                <w:b w:val="false"/>
+                <w:bCs w:val="false"/>
+                <w:i/>
+                <w:iCs/>
+                <w:sz w:val="24"/>
+                <w:szCs w:val="24"/>
+              </w:rPr>
+              <w:t xml:space="preserve">95% CI</w:t>
+            </w:r>
+          </w:p>
+        </w:tc>
+        <w:tc>
+          <w:tcPr>
+            <w:tcW w:type="dxa" w:w="1400"/>
+            <w:tcBorders>
+              <w:top w:val="none" w:color="FFFFFF" w:sz="0"/>
+              <w:left w:val="none" w:color="FFFFFF" w:sz="0"/>
+              <w:bottom w:val="single" w:color="000000" w:sz="4"/>
+              <w:right w:val="none" w:color="FFFFFF" w:sz="0"/>
+            </w:tcBorders>
+            <w:tcMar>
+              <w:top w:type="dxa" w:w="20"/>
+              <w:left w:type="dxa" w:w="80"/>
+              <w:bottom w:type="dxa" w:w="20"/>
+              <w:right w:type="dxa" w:w="80"/>
+            </w:tcMar>
+          </w:tcPr>
+          <w:p>
+            <w:pPr>
+              <w:spacing w:after="20" w:before="20" w:line="240"/>
+              <w:jc w:val="center"/>
+            </w:pPr>
+            <w:r>
+              <w:rPr>
+                <w:rFonts w:ascii="Times New Roman" w:cs="Times New Roman" w:eastAsia="Times New Roman" w:hAnsi="Times New Roman"/>
+                <w:b w:val="false"/>
+                <w:bCs w:val="false"/>
+                <w:i/>
+                <w:iCs/>
+                <w:sz w:val="24"/>
+                <w:szCs w:val="24"/>
+              </w:rPr>
+              <w:t xml:space="preserve">p</w:t>
+            </w:r>
+          </w:p>
+        </w:tc>
+      </w:tr>
+      <w:tr>
+        <w:tc>
+          <w:tcPr>
+            <w:tcW w:type="dxa" w:w="4060"/>
+            <w:tcBorders>
+              <w:top w:val="none" w:color="FFFFFF" w:sz="0"/>
+              <w:left w:val="none" w:color="FFFFFF" w:sz="0"/>
+              <w:bottom w:val="none" w:color="FFFFFF" w:sz="0"/>
+              <w:right w:val="none" w:color="FFFFFF" w:sz="0"/>
+            </w:tcBorders>
+            <w:tcMar>
+              <w:top w:type="dxa" w:w="20"/>
+              <w:left w:type="dxa" w:w="80"/>
+              <w:bottom w:type="dxa" w:w="20"/>
+              <w:right w:type="dxa" w:w="80"/>
+            </w:tcMar>
+          </w:tcPr>
+          <w:p>
+            <w:pPr>
+              <w:spacing w:after="20" w:before="20" w:line="240"/>
+              <w:jc w:val="left"/>
+            </w:pPr>
+            <w:r>
+              <w:rPr>
+                <w:rFonts w:ascii="Times New Roman" w:cs="Times New Roman" w:eastAsia="Times New Roman" w:hAnsi="Times New Roman"/>
+                <w:b w:val="false"/>
+                <w:bCs w:val="false"/>
+                <w:i w:val="false"/>
+                <w:iCs w:val="false"/>
+                <w:sz w:val="24"/>
+                <w:szCs w:val="24"/>
+              </w:rPr>
+              <w:t xml:space="preserve">Precipitation seasonality (CV)</w:t>
+            </w:r>
+          </w:p>
+        </w:tc>
+        <w:tc>
+          <w:tcPr>
+            <w:tcW w:type="dxa" w:w="1400"/>
+            <w:tcBorders>
+              <w:top w:val="none" w:color="FFFFFF" w:sz="0"/>
+              <w:left w:val="none" w:color="FFFFFF" w:sz="0"/>
+              <w:bottom w:val="none" w:color="FFFFFF" w:sz="0"/>
+              <w:right w:val="none" w:color="FFFFFF" w:sz="0"/>
+            </w:tcBorders>
+            <w:tcMar>
+              <w:top w:type="dxa" w:w="20"/>
+              <w:left w:type="dxa" w:w="80"/>
+              <w:bottom w:type="dxa" w:w="20"/>
+              <w:right w:type="dxa" w:w="80"/>
+            </w:tcMar>
+          </w:tcPr>
+          <w:p>
+            <w:pPr>
+              <w:spacing w:after="20" w:before="20" w:line="240"/>
+              <w:jc w:val="center"/>
+            </w:pPr>
+            <w:r>
+              <w:rPr>
+                <w:rFonts w:ascii="Times New Roman" w:cs="Times New Roman" w:eastAsia="Times New Roman" w:hAnsi="Times New Roman"/>
+                <w:b w:val="false"/>
+                <w:bCs w:val="false"/>
+                <w:i w:val="false"/>
+                <w:iCs w:val="false"/>
+                <w:sz w:val="24"/>
+                <w:szCs w:val="24"/>
+              </w:rPr>
+              <w:t xml:space="preserve">0.31</w:t>
+            </w:r>
+          </w:p>
+        </w:tc>
+        <w:tc>
+          <w:tcPr>
+            <w:tcW w:type="dxa" w:w="2500"/>
+            <w:tcBorders>
+              <w:top w:val="none" w:color="FFFFFF" w:sz="0"/>
+              <w:left w:val="none" w:color="FFFFFF" w:sz="0"/>
+              <w:bottom w:val="none" w:color="FFFFFF" w:sz="0"/>
+              <w:right w:val="none" w:color="FFFFFF" w:sz="0"/>
+            </w:tcBorders>
+            <w:tcMar>
+              <w:top w:type="dxa" w:w="20"/>
+              <w:left w:type="dxa" w:w="80"/>
+              <w:bottom w:type="dxa" w:w="20"/>
+              <w:right w:type="dxa" w:w="80"/>
+            </w:tcMar>
+          </w:tcPr>
+          <w:p>
+            <w:pPr>
+              <w:spacing w:after="20" w:before="20" w:line="240"/>
+              <w:jc w:val="center"/>
+            </w:pPr>
+            <w:r>
+              <w:rPr>
+                <w:rFonts w:ascii="Times New Roman" w:cs="Times New Roman" w:eastAsia="Times New Roman" w:hAnsi="Times New Roman"/>
+                <w:b w:val="false"/>
+                <w:bCs w:val="false"/>
+                <w:i w:val="false"/>
+                <w:iCs w:val="false"/>
+                <w:sz w:val="24"/>
+                <w:szCs w:val="24"/>
+              </w:rPr>
+              <w:t xml:space="preserve">[0.17, 0.57]</w:t>
+            </w:r>
+          </w:p>
+        </w:tc>
+        <w:tc>
+          <w:tcPr>
+            <w:tcW w:type="dxa" w:w="1400"/>
+            <w:tcBorders>
+              <w:top w:val="none" w:color="FFFFFF" w:sz="0"/>
+              <w:left w:val="none" w:color="FFFFFF" w:sz="0"/>
+              <w:bottom w:val="none" w:color="FFFFFF" w:sz="0"/>
+              <w:right w:val="none" w:color="FFFFFF" w:sz="0"/>
+            </w:tcBorders>
+            <w:tcMar>
+              <w:top w:type="dxa" w:w="20"/>
+              <w:left w:type="dxa" w:w="80"/>
+              <w:bottom w:type="dxa" w:w="20"/>
+              <w:right w:type="dxa" w:w="80"/>
+            </w:tcMar>
+          </w:tcPr>
+          <w:p>
+            <w:pPr>
+              <w:spacing w:after="20" w:before="20" w:line="240"/>
+              <w:jc w:val="center"/>
+            </w:pPr>
+            <w:r>
+              <w:rPr>
+                <w:rFonts w:ascii="Times New Roman" w:cs="Times New Roman" w:eastAsia="Times New Roman" w:hAnsi="Times New Roman"/>
+                <w:b w:val="false"/>
+                <w:bCs w:val="false"/>
+                <w:i w:val="false"/>
+                <w:iCs w:val="false"/>
+                <w:sz w:val="24"/>
+                <w:szCs w:val="24"/>
+              </w:rPr>
+              <w:t xml:space="preserve">&lt; .001</w:t>
+            </w:r>
+          </w:p>
+        </w:tc>
+      </w:tr>
+      <w:tr>
+        <w:tc>
+          <w:tcPr>
+            <w:tcW w:type="dxa" w:w="4060"/>
+            <w:tcBorders>
+              <w:top w:val="none" w:color="FFFFFF" w:sz="0"/>
+              <w:left w:val="none" w:color="FFFFFF" w:sz="0"/>
+              <w:bottom w:val="none" w:color="FFFFFF" w:sz="0"/>
+              <w:right w:val="none" w:color="FFFFFF" w:sz="0"/>
+            </w:tcBorders>
+            <w:tcMar>
+              <w:top w:type="dxa" w:w="20"/>
+              <w:left w:type="dxa" w:w="80"/>
+              <w:bottom w:type="dxa" w:w="20"/>
+              <w:right w:type="dxa" w:w="80"/>
+            </w:tcMar>
+          </w:tcPr>
+          <w:p>
+            <w:pPr>
+              <w:spacing w:after="20" w:before="20" w:line="240"/>
+              <w:jc w:val="left"/>
+            </w:pPr>
+            <w:r>
+              <w:rPr>
+                <w:rFonts w:ascii="Times New Roman" w:cs="Times New Roman" w:eastAsia="Times New Roman" w:hAnsi="Times New Roman"/>
+                <w:b w:val="false"/>
+                <w:bCs w:val="false"/>
+                <w:i w:val="false"/>
+                <w:iCs w:val="false"/>
+                <w:sz w:val="24"/>
+                <w:szCs w:val="24"/>
+              </w:rPr>
+              <w:t xml:space="preserve">Population density (log)</w:t>
+            </w:r>
+          </w:p>
+        </w:tc>
+        <w:tc>
+          <w:tcPr>
+            <w:tcW w:type="dxa" w:w="1400"/>
+            <w:tcBorders>
+              <w:top w:val="none" w:color="FFFFFF" w:sz="0"/>
+              <w:left w:val="none" w:color="FFFFFF" w:sz="0"/>
+              <w:bottom w:val="none" w:color="FFFFFF" w:sz="0"/>
+              <w:right w:val="none" w:color="FFFFFF" w:sz="0"/>
+            </w:tcBorders>
+            <w:tcMar>
+              <w:top w:type="dxa" w:w="20"/>
+              <w:left w:type="dxa" w:w="80"/>
+              <w:bottom w:type="dxa" w:w="20"/>
+              <w:right w:type="dxa" w:w="80"/>
+            </w:tcMar>
+          </w:tcPr>
+          <w:p>
+            <w:pPr>
+              <w:spacing w:after="20" w:before="20" w:line="240"/>
+              <w:jc w:val="center"/>
+            </w:pPr>
+            <w:r>
+              <w:rPr>
+                <w:rFonts w:ascii="Times New Roman" w:cs="Times New Roman" w:eastAsia="Times New Roman" w:hAnsi="Times New Roman"/>
+                <w:b w:val="false"/>
+                <w:bCs w:val="false"/>
+                <w:i w:val="false"/>
+                <w:iCs w:val="false"/>
+                <w:sz w:val="24"/>
+                <w:szCs w:val="24"/>
+              </w:rPr>
+              <w:t xml:space="preserve">0.23</w:t>
+            </w:r>
+          </w:p>
+        </w:tc>
+        <w:tc>
+          <w:tcPr>
+            <w:tcW w:type="dxa" w:w="2500"/>
+            <w:tcBorders>
+              <w:top w:val="none" w:color="FFFFFF" w:sz="0"/>
+              <w:left w:val="none" w:color="FFFFFF" w:sz="0"/>
+              <w:bottom w:val="none" w:color="FFFFFF" w:sz="0"/>
+              <w:right w:val="none" w:color="FFFFFF" w:sz="0"/>
+            </w:tcBorders>
+            <w:tcMar>
+              <w:top w:type="dxa" w:w="20"/>
+              <w:left w:type="dxa" w:w="80"/>
+              <w:bottom w:type="dxa" w:w="20"/>
+              <w:right w:type="dxa" w:w="80"/>
+            </w:tcMar>
+          </w:tcPr>
+          <w:p>
+            <w:pPr>
+              <w:spacing w:after="20" w:before="20" w:line="240"/>
+              <w:jc w:val="center"/>
+            </w:pPr>
+            <w:r>
+              <w:rPr>
+                <w:rFonts w:ascii="Times New Roman" w:cs="Times New Roman" w:eastAsia="Times New Roman" w:hAnsi="Times New Roman"/>
+                <w:b w:val="false"/>
+                <w:bCs w:val="false"/>
+                <w:i w:val="false"/>
+                <w:iCs w:val="false"/>
+                <w:sz w:val="24"/>
+                <w:szCs w:val="24"/>
+              </w:rPr>
+              <w:t xml:space="preserve">[0.11, 0.49]</w:t>
+            </w:r>
+          </w:p>
+        </w:tc>
+        <w:tc>
+          <w:tcPr>
+            <w:tcW w:type="dxa" w:w="1400"/>
+            <w:tcBorders>
+              <w:top w:val="none" w:color="FFFFFF" w:sz="0"/>
+              <w:left w:val="none" w:color="FFFFFF" w:sz="0"/>
+              <w:bottom w:val="none" w:color="FFFFFF" w:sz="0"/>
+              <w:right w:val="none" w:color="FFFFFF" w:sz="0"/>
+            </w:tcBorders>
+            <w:tcMar>
+              <w:top w:type="dxa" w:w="20"/>
+              <w:left w:type="dxa" w:w="80"/>
+              <w:bottom w:type="dxa" w:w="20"/>
+              <w:right w:type="dxa" w:w="80"/>
+            </w:tcMar>
+          </w:tcPr>
+          <w:p>
+            <w:pPr>
+              <w:spacing w:after="20" w:before="20" w:line="240"/>
+              <w:jc w:val="center"/>
+            </w:pPr>
+            <w:r>
+              <w:rPr>
+                <w:rFonts w:ascii="Times New Roman" w:cs="Times New Roman" w:eastAsia="Times New Roman" w:hAnsi="Times New Roman"/>
+                <w:b w:val="false"/>
+                <w:bCs w:val="false"/>
+                <w:i w:val="false"/>
+                <w:iCs w:val="false"/>
+                <w:sz w:val="24"/>
+                <w:szCs w:val="24"/>
+              </w:rPr>
+              <w:t xml:space="preserve">&lt; .001</w:t>
+            </w:r>
+          </w:p>
+        </w:tc>
+      </w:tr>
+      <w:tr>
+        <w:tc>
+          <w:tcPr>
+            <w:tcW w:type="dxa" w:w="4060"/>
+            <w:tcBorders>
+              <w:top w:val="none" w:color="FFFFFF" w:sz="0"/>
+              <w:left w:val="none" w:color="FFFFFF" w:sz="0"/>
+              <w:bottom w:val="none" w:color="FFFFFF" w:sz="0"/>
+              <w:right w:val="none" w:color="FFFFFF" w:sz="0"/>
+            </w:tcBorders>
+            <w:tcMar>
+              <w:top w:type="dxa" w:w="20"/>
+              <w:left w:type="dxa" w:w="80"/>
+              <w:bottom w:type="dxa" w:w="20"/>
+              <w:right w:type="dxa" w:w="80"/>
+            </w:tcMar>
+          </w:tcPr>
+          <w:p>
+            <w:pPr>
+              <w:spacing w:after="20" w:before="20" w:line="240"/>
+              <w:jc w:val="left"/>
+            </w:pPr>
+            <w:r>
+              <w:rPr>
+                <w:rFonts w:ascii="Times New Roman" w:cs="Times New Roman" w:eastAsia="Times New Roman" w:hAnsi="Times New Roman"/>
+                <w:b w:val="false"/>
+                <w:bCs w:val="false"/>
+                <w:i/>
+                <w:iCs/>
+                <w:sz w:val="24"/>
+                <w:szCs w:val="24"/>
+              </w:rPr>
+              <w:t xml:space="preserve">M. natalensis</w:t>
+            </w:r>
+            <w:r>
+              <w:rPr>
+                <w:rFonts w:ascii="Times New Roman" w:cs="Times New Roman" w:eastAsia="Times New Roman" w:hAnsi="Times New Roman"/>
+                <w:b w:val="false"/>
+                <w:bCs w:val="false"/>
+                <w:i w:val="false"/>
+                <w:iCs w:val="false"/>
+                <w:sz w:val="24"/>
+                <w:szCs w:val="24"/>
+              </w:rPr>
+              <w:t xml:space="preserve"> occurrences</w:t>
+            </w:r>
+          </w:p>
+        </w:tc>
+        <w:tc>
+          <w:tcPr>
+            <w:tcW w:type="dxa" w:w="1400"/>
+            <w:tcBorders>
+              <w:top w:val="none" w:color="FFFFFF" w:sz="0"/>
+              <w:left w:val="none" w:color="FFFFFF" w:sz="0"/>
+              <w:bottom w:val="none" w:color="FFFFFF" w:sz="0"/>
+              <w:right w:val="none" w:color="FFFFFF" w:sz="0"/>
+            </w:tcBorders>
+            <w:tcMar>
+              <w:top w:type="dxa" w:w="20"/>
+              <w:left w:type="dxa" w:w="80"/>
+              <w:bottom w:type="dxa" w:w="20"/>
+              <w:right w:type="dxa" w:w="80"/>
+            </w:tcMar>
+          </w:tcPr>
+          <w:p>
+            <w:pPr>
+              <w:spacing w:after="20" w:before="20" w:line="240"/>
+              <w:jc w:val="center"/>
+            </w:pPr>
+            <w:r>
+              <w:rPr>
+                <w:rFonts w:ascii="Times New Roman" w:cs="Times New Roman" w:eastAsia="Times New Roman" w:hAnsi="Times New Roman"/>
+                <w:b w:val="false"/>
+                <w:bCs w:val="false"/>
+                <w:i w:val="false"/>
+                <w:iCs w:val="false"/>
+                <w:sz w:val="24"/>
+                <w:szCs w:val="24"/>
+              </w:rPr>
+              <w:t xml:space="preserve">1.02</w:t>
+            </w:r>
+          </w:p>
+        </w:tc>
+        <w:tc>
+          <w:tcPr>
+            <w:tcW w:type="dxa" w:w="2500"/>
+            <w:tcBorders>
+              <w:top w:val="none" w:color="FFFFFF" w:sz="0"/>
+              <w:left w:val="none" w:color="FFFFFF" w:sz="0"/>
+              <w:bottom w:val="none" w:color="FFFFFF" w:sz="0"/>
+              <w:right w:val="none" w:color="FFFFFF" w:sz="0"/>
+            </w:tcBorders>
+            <w:tcMar>
+              <w:top w:type="dxa" w:w="20"/>
+              <w:left w:type="dxa" w:w="80"/>
+              <w:bottom w:type="dxa" w:w="20"/>
+              <w:right w:type="dxa" w:w="80"/>
+            </w:tcMar>
+          </w:tcPr>
+          <w:p>
+            <w:pPr>
+              <w:spacing w:after="20" w:before="20" w:line="240"/>
+              <w:jc w:val="center"/>
+            </w:pPr>
+            <w:r>
+              <w:rPr>
+                <w:rFonts w:ascii="Times New Roman" w:cs="Times New Roman" w:eastAsia="Times New Roman" w:hAnsi="Times New Roman"/>
+                <w:b w:val="false"/>
+                <w:bCs w:val="false"/>
+                <w:i w:val="false"/>
+                <w:iCs w:val="false"/>
+                <w:sz w:val="24"/>
+                <w:szCs w:val="24"/>
+              </w:rPr>
+              <w:t xml:space="preserve">[0.56, 1.85]</w:t>
+            </w:r>
+          </w:p>
+        </w:tc>
+        <w:tc>
+          <w:tcPr>
+            <w:tcW w:type="dxa" w:w="1400"/>
+            <w:tcBorders>
+              <w:top w:val="none" w:color="FFFFFF" w:sz="0"/>
+              <w:left w:val="none" w:color="FFFFFF" w:sz="0"/>
+              <w:bottom w:val="none" w:color="FFFFFF" w:sz="0"/>
+              <w:right w:val="none" w:color="FFFFFF" w:sz="0"/>
+            </w:tcBorders>
+            <w:tcMar>
+              <w:top w:type="dxa" w:w="20"/>
+              <w:left w:type="dxa" w:w="80"/>
+              <w:bottom w:type="dxa" w:w="20"/>
+              <w:right w:type="dxa" w:w="80"/>
+            </w:tcMar>
+          </w:tcPr>
+          <w:p>
+            <w:pPr>
+              <w:spacing w:after="20" w:before="20" w:line="240"/>
+              <w:jc w:val="center"/>
+            </w:pPr>
+            <w:r>
+              <w:rPr>
+                <w:rFonts w:ascii="Times New Roman" w:cs="Times New Roman" w:eastAsia="Times New Roman" w:hAnsi="Times New Roman"/>
+                <w:b w:val="false"/>
+                <w:bCs w:val="false"/>
+                <w:i w:val="false"/>
+                <w:iCs w:val="false"/>
+                <w:sz w:val="24"/>
+                <w:szCs w:val="24"/>
+              </w:rPr>
+              <w:t xml:space="preserve">.944</w:t>
+            </w:r>
+          </w:p>
+        </w:tc>
+      </w:tr>
+    </w:tbl>
+    <w:p>
+      <w:pPr>
+        <w:spacing w:before="60" w:line="240"/>
+      </w:pPr>
+      <w:r>
+        <w:rPr>
+          <w:rFonts w:ascii="Times New Roman" w:cs="Times New Roman" w:eastAsia="Times New Roman" w:hAnsi="Times New Roman"/>
+          <w:b w:val="false"/>
+          <w:bCs w:val="false"/>
+          <w:i/>
+          <w:iCs/>
+          <w:sz w:val="24"/>
+          <w:szCs w:val="24"/>
+        </w:rPr>
+        <w:t xml:space="preserve">Note.</w:t>
+      </w:r>
+      <w:r>
+        <w:rPr>
+          <w:rFonts w:ascii="Times New Roman" w:cs="Times New Roman" w:eastAsia="Times New Roman" w:hAnsi="Times New Roman"/>
+          <w:b w:val="false"/>
+          <w:bCs w:val="false"/>
+          <w:i w:val="false"/>
+          <w:iCs w:val="false"/>
+          <w:sz w:val="24"/>
+          <w:szCs w:val="24"/>
+        </w:rPr>
+        <w:t xml:space="preserve"> IRR = incidence-rate ratio per one standard-deviation increase; exposure = population; dispersion estimated (</w:t>
+      </w:r>
+      <w:r>
+        <w:rPr>
+          <w:rFonts w:ascii="Times New Roman" w:cs="Times New Roman" w:eastAsia="Times New Roman" w:hAnsi="Times New Roman"/>
+          <w:b w:val="false"/>
+          <w:bCs w:val="false"/>
+          <w:i/>
+          <w:iCs/>
+          <w:sz w:val="24"/>
+          <w:szCs w:val="24"/>
+        </w:rPr>
+        <w:t xml:space="preserve">α</w:t>
+      </w:r>
+      <w:r>
+        <w:rPr>
+          <w:rFonts w:ascii="Times New Roman" w:cs="Times New Roman" w:eastAsia="Times New Roman" w:hAnsi="Times New Roman"/>
+          <w:b w:val="false"/>
+          <w:bCs w:val="false"/>
+          <w:i w:val="false"/>
+          <w:iCs w:val="false"/>
+          <w:sz w:val="24"/>
+          <w:szCs w:val="24"/>
+        </w:rPr>
+        <w:t xml:space="preserve"> = 2.82). Rainfall seasonality is retained as a single, mechanistic proxy for the collinear north–south gradient (latitude, rainfall, temperature seasonality, and poverty; PCA first component = 91.3% of variance). All variance inflation factors &lt; 1.4.</w:t>
       </w:r>
     </w:p>
     <w:p>

</xml_diff>

<commit_message>
Format Results .docx: center-align text (Times New Roman 12, double-spaced)
Co-Authored-By: Claude Opus 4.8 <noreply@anthropic.com>
Claude-Session: https://claude.ai/code/session_019cbq1tyoouCuxchqATwqmE
</commit_message>
<xml_diff>
--- a/lassa_spatial/manuscript/Results_section_APA.docx
+++ b/lassa_spatial/manuscript/Results_section_APA.docx
@@ -36,7 +36,7 @@
     <w:p>
       <w:pPr>
         <w:spacing w:after="0" w:line="480"/>
-        <w:ind w:firstLine="720"/>
+        <w:jc w:val="center"/>
       </w:pPr>
       <w:r>
         <w:rPr>
@@ -213,7 +213,7 @@
     <w:p>
       <w:pPr>
         <w:spacing w:after="0" w:line="480"/>
-        <w:ind w:firstLine="720"/>
+        <w:jc w:val="center"/>
       </w:pPr>
       <w:r>
         <w:rPr>
@@ -471,7 +471,7 @@
     <w:p>
       <w:pPr>
         <w:spacing w:after="0" w:line="480"/>
-        <w:ind w:firstLine="720"/>
+        <w:jc w:val="center"/>
       </w:pPr>
       <w:r>
         <w:rPr>
@@ -552,7 +552,7 @@
     <w:p>
       <w:pPr>
         <w:spacing w:after="0" w:line="480"/>
-        <w:ind w:firstLine="720"/>
+        <w:jc w:val="center"/>
       </w:pPr>
       <w:r>
         <w:rPr>
@@ -753,7 +753,7 @@
     <w:p>
       <w:pPr>
         <w:spacing w:after="0" w:line="480"/>
-        <w:ind w:firstLine="720"/>
+        <w:jc w:val="center"/>
       </w:pPr>
       <w:r>
         <w:rPr>
@@ -867,7 +867,7 @@
     <w:p>
       <w:pPr>
         <w:spacing w:after="0" w:line="480"/>
-        <w:ind w:firstLine="720"/>
+        <w:jc w:val="center"/>
       </w:pPr>
       <w:r>
         <w:rPr>
@@ -972,7 +972,7 @@
     <w:p>
       <w:pPr>
         <w:spacing w:after="0" w:line="480"/>
-        <w:ind w:firstLine="720"/>
+        <w:jc w:val="center"/>
       </w:pPr>
       <w:r>
         <w:rPr>
@@ -1062,7 +1062,7 @@
     <w:p>
       <w:pPr>
         <w:spacing w:after="0" w:line="480"/>
-        <w:ind w:firstLine="720"/>
+        <w:jc w:val="center"/>
       </w:pPr>
       <w:r>
         <w:rPr>
@@ -1272,7 +1272,7 @@
     <w:p>
       <w:pPr>
         <w:spacing w:after="0" w:line="480"/>
-        <w:ind w:firstLine="720"/>
+        <w:jc w:val="center"/>
       </w:pPr>
       <w:r>
         <w:rPr>
@@ -1545,7 +1545,7 @@
     <w:p>
       <w:pPr>
         <w:spacing w:after="0" w:line="480"/>
-        <w:ind w:firstLine="720"/>
+        <w:jc w:val="center"/>
       </w:pPr>
       <w:r>
         <w:rPr>
@@ -8248,7 +8248,11 @@
         <w:szCs w:val="24"/>
       </w:rPr>
     </w:rPrDefault>
-    <w:pPrDefault/>
+    <w:pPrDefault>
+      <w:pPr>
+        <w:jc w:val="center"/>
+      </w:pPr>
+    </w:pPrDefault>
   </w:docDefaults>
   <w:style w:type="paragraph" w:styleId="Title">
     <w:name w:val="Title"/>

</xml_diff>

<commit_message>
Phase 5: add Bayesian BYM spatial regression (the reportable spatial model)
fit_bym.py: Bayesian negative binomial Besag-York-Mollie model (ICAR
structured + unstructured random effects, log-pop offset, rainfall seasonality
+ density fixed effects), HMC via PyMC.

Result: spatial fraction phi=0.22 [0.00,0.85]; LOO does not favor the spatial
model over non-spatial (dELPD -1.0); but the smoothed residual spatial RR map
recovers the endemic central-eastern belt (Edo 3.98, Bauchi 3.74, Ebonyi 2.96,
Taraba 2.68, Ondo 2.50). A formal spatial regression is reportable, but a
decisive spatial signal needs LGA-scale data.

Manuscript: added 'Bayesian Spatial (BYM) Model' subsection + Figure 4 (RR map)
to Results (.md and .docx). FINDINGS phase 5; pymc/arviz in requirements.

Co-Authored-By: Claude Opus 4.8 <noreply@anthropic.com>
Claude-Session: https://claude.ai/code/session_019cbq1tyoouCuxchqATwqmE
</commit_message>
<xml_diff>
--- a/lassa_spatial/manuscript/Results_section_APA.docx
+++ b/lassa_spatial/manuscript/Results_section_APA.docx
@@ -1525,6 +1525,177 @@
           <w:szCs w:val="24"/>
         </w:rPr>
         <w:t xml:space="preserve"> = .30 vs. .05), consistent with detected cases being governed heavily by where and how intensively surveillance was conducted.</w:t>
+      </w:r>
+    </w:p>
+    <w:p>
+      <w:pPr>
+        <w:spacing w:after="0" w:before="120" w:line="480"/>
+      </w:pPr>
+      <w:r>
+        <w:rPr>
+          <w:rFonts w:ascii="Times New Roman" w:cs="Times New Roman" w:eastAsia="Times New Roman" w:hAnsi="Times New Roman"/>
+          <w:b/>
+          <w:bCs/>
+          <w:sz w:val="24"/>
+          <w:szCs w:val="24"/>
+        </w:rPr>
+        <w:t xml:space="preserve">Bayesian Spatial (BYM) Model</w:t>
+      </w:r>
+    </w:p>
+    <w:p>
+      <w:pPr>
+        <w:spacing w:after="0" w:line="480"/>
+        <w:jc w:val="center"/>
+      </w:pPr>
+      <w:r>
+        <w:rPr>
+          <w:rFonts w:ascii="Times New Roman" w:cs="Times New Roman" w:eastAsia="Times New Roman" w:hAnsi="Times New Roman"/>
+          <w:b w:val="false"/>
+          <w:bCs w:val="false"/>
+          <w:i w:val="false"/>
+          <w:iCs w:val="false"/>
+          <w:sz w:val="24"/>
+          <w:szCs w:val="24"/>
+        </w:rPr>
+        <w:t xml:space="preserve">Because the spatial-econometric diagnostics above test only for residual linear-Gaussian dependence, we additionally fitted the disease-mapping standard: a Bayesian hierarchical negative binomial model with a log-population offset, the two separable fixed effects (rainfall seasonality and log population density), and two area random effects—a spatially structured intrinsic conditional autoregressive (ICAR) term on the queen adjacency graph and an unstructured independent term (Besag–York–Mollié specification). The model was estimated by Hamiltonian Monte Carlo (4 chains, 1,500 post-warmup draws each; maximum R-hat = 1.01).</w:t>
+      </w:r>
+    </w:p>
+    <w:p>
+      <w:pPr>
+        <w:spacing w:after="0" w:line="480"/>
+        <w:jc w:val="center"/>
+      </w:pPr>
+      <w:r>
+        <w:rPr>
+          <w:rFonts w:ascii="Times New Roman" w:cs="Times New Roman" w:eastAsia="Times New Roman" w:hAnsi="Times New Roman"/>
+          <w:b w:val="false"/>
+          <w:bCs w:val="false"/>
+          <w:i w:val="false"/>
+          <w:iCs w:val="false"/>
+          <w:sz w:val="24"/>
+          <w:szCs w:val="24"/>
+        </w:rPr>
+        <w:t xml:space="preserve">The fixed-effect gradients were retained, with high posterior probability of a protective direction: incidence decreased with rainfall seasonality (IRR = 0.45, 95% credible interval [0.18, 1.06]; posterior </w:t>
+      </w:r>
+      <w:r>
+        <w:rPr>
+          <w:rFonts w:ascii="Times New Roman" w:cs="Times New Roman" w:eastAsia="Times New Roman" w:hAnsi="Times New Roman"/>
+          <w:b w:val="false"/>
+          <w:bCs w:val="false"/>
+          <w:i/>
+          <w:iCs/>
+          <w:sz w:val="24"/>
+          <w:szCs w:val="24"/>
+        </w:rPr>
+        <w:t xml:space="preserve">P</w:t>
+      </w:r>
+      <w:r>
+        <w:rPr>
+          <w:rFonts w:ascii="Times New Roman" w:cs="Times New Roman" w:eastAsia="Times New Roman" w:hAnsi="Times New Roman"/>
+          <w:b w:val="false"/>
+          <w:bCs w:val="false"/>
+          <w:i w:val="false"/>
+          <w:iCs w:val="false"/>
+          <w:sz w:val="24"/>
+          <w:szCs w:val="24"/>
+        </w:rPr>
+        <w:t xml:space="preserve">(IRR &lt; 1) = .97) and with population density (IRR = 0.56, 95% CrI [0.28, 1.11]; </w:t>
+      </w:r>
+      <w:r>
+        <w:rPr>
+          <w:rFonts w:ascii="Times New Roman" w:cs="Times New Roman" w:eastAsia="Times New Roman" w:hAnsi="Times New Roman"/>
+          <w:b w:val="false"/>
+          <w:bCs w:val="false"/>
+          <w:i/>
+          <w:iCs/>
+          <w:sz w:val="24"/>
+          <w:szCs w:val="24"/>
+        </w:rPr>
+        <w:t xml:space="preserve">P</w:t>
+      </w:r>
+      <w:r>
+        <w:rPr>
+          <w:rFonts w:ascii="Times New Roman" w:cs="Times New Roman" w:eastAsia="Times New Roman" w:hAnsi="Times New Roman"/>
+          <w:b w:val="false"/>
+          <w:bCs w:val="false"/>
+          <w:i w:val="false"/>
+          <w:iCs w:val="false"/>
+          <w:sz w:val="24"/>
+          <w:szCs w:val="24"/>
+        </w:rPr>
+        <w:t xml:space="preserve">(IRR &lt; 1) = .95). The structured random effect accounted for an estimated 22% of the residual area-level variance (spatial fraction </w:t>
+      </w:r>
+      <w:r>
+        <w:rPr>
+          <w:rFonts w:ascii="Times New Roman" w:cs="Times New Roman" w:eastAsia="Times New Roman" w:hAnsi="Times New Roman"/>
+          <w:b w:val="false"/>
+          <w:bCs w:val="false"/>
+          <w:i/>
+          <w:iCs/>
+          <w:sz w:val="24"/>
+          <w:szCs w:val="24"/>
+        </w:rPr>
+        <w:t xml:space="preserve">φ</w:t>
+      </w:r>
+      <w:r>
+        <w:rPr>
+          <w:rFonts w:ascii="Times New Roman" w:cs="Times New Roman" w:eastAsia="Times New Roman" w:hAnsi="Times New Roman"/>
+          <w:b w:val="false"/>
+          <w:bCs w:val="false"/>
+          <w:i w:val="false"/>
+          <w:iCs w:val="false"/>
+          <w:sz w:val="24"/>
+          <w:szCs w:val="24"/>
+        </w:rPr>
+        <w:t xml:space="preserve"> = 0.22, 95% CrI [0.00, 0.85]); the wide interval, spanning zero, indicates that the spatial and unstructured components cannot be reliably separated with only 37 areas. Consistent with this, leave-one-out cross-validation did not favor the spatial model over an otherwise identical non-spatial model (ΔELPD = −1.0, </w:t>
+      </w:r>
+      <w:r>
+        <w:rPr>
+          <w:rFonts w:ascii="Times New Roman" w:cs="Times New Roman" w:eastAsia="Times New Roman" w:hAnsi="Times New Roman"/>
+          <w:b w:val="false"/>
+          <w:bCs w:val="false"/>
+          <w:i/>
+          <w:iCs/>
+          <w:sz w:val="24"/>
+          <w:szCs w:val="24"/>
+        </w:rPr>
+        <w:t xml:space="preserve">SE</w:t>
+      </w:r>
+      <w:r>
+        <w:rPr>
+          <w:rFonts w:ascii="Times New Roman" w:cs="Times New Roman" w:eastAsia="Times New Roman" w:hAnsi="Times New Roman"/>
+          <w:b w:val="false"/>
+          <w:bCs w:val="false"/>
+          <w:i w:val="false"/>
+          <w:iCs w:val="false"/>
+          <w:sz w:val="24"/>
+          <w:szCs w:val="24"/>
+        </w:rPr>
+        <w:t xml:space="preserve"> = 0.8). Nonetheless, the smoothed residual spatial relative-risk surface (Figure 4) localized a coherent central–eastern high-risk belt that persisted after adjustment for climate and density—Edo (RR = 3.98), Bauchi (3.74), Ebonyi (2.96), Taraba (2.68), Plateau (2.61), and Ondo (2.50)—with the lowest residual risk in the south-west (Osun, Ogun, Kwara). The spatial regression is therefore estimable and informative for hypothesis generation, but a definitive spatial signal is not identifiable at state resolution and would require local-government-area (</w:t>
+      </w:r>
+      <w:r>
+        <w:rPr>
+          <w:rFonts w:ascii="Times New Roman" w:cs="Times New Roman" w:eastAsia="Times New Roman" w:hAnsi="Times New Roman"/>
+          <w:b w:val="false"/>
+          <w:bCs w:val="false"/>
+          <w:i/>
+          <w:iCs/>
+          <w:sz w:val="24"/>
+          <w:szCs w:val="24"/>
+        </w:rPr>
+        <w:t xml:space="preserve">n</w:t>
+      </w:r>
+      <w:r>
+        <w:rPr>
+          <w:rFonts w:ascii="Times New Roman" w:cs="Times New Roman" w:eastAsia="Times New Roman" w:hAnsi="Times New Roman"/>
+          <w:b w:val="false"/>
+          <w:bCs w:val="false"/>
+          <w:i w:val="false"/>
+          <w:iCs w:val="false"/>
+          <w:sz w:val="24"/>
+          <w:szCs w:val="24"/>
+        </w:rPr>
+        <w:t xml:space="preserve"> = 774) data.</w:t>
       </w:r>
     </w:p>
     <w:p>
@@ -8053,6 +8224,161 @@
           <w:szCs w:val="24"/>
         </w:rPr>
         <w:t xml:space="preserve"> = .94) illustrates the dependence of detected burden on surveillance intensity.</w:t>
+      </w:r>
+    </w:p>
+    <w:p>
+      <w:pPr>
+        <w:spacing w:before="240" w:line="480"/>
+      </w:pPr>
+      <w:r>
+        <w:rPr>
+          <w:rFonts w:ascii="Times New Roman" w:cs="Times New Roman" w:eastAsia="Times New Roman" w:hAnsi="Times New Roman"/>
+          <w:b/>
+          <w:bCs/>
+          <w:sz w:val="24"/>
+          <w:szCs w:val="24"/>
+        </w:rPr>
+        <w:t xml:space="preserve">Figure 4</w:t>
+      </w:r>
+    </w:p>
+    <w:p>
+      <w:pPr>
+        <w:spacing w:line="480"/>
+      </w:pPr>
+      <w:r>
+        <w:rPr>
+          <w:rFonts w:ascii="Times New Roman" w:cs="Times New Roman" w:eastAsia="Times New Roman" w:hAnsi="Times New Roman"/>
+          <w:b w:val="false"/>
+          <w:bCs w:val="false"/>
+          <w:i/>
+          <w:iCs/>
+          <w:sz w:val="24"/>
+          <w:szCs w:val="24"/>
+        </w:rPr>
+        <w:t xml:space="preserve">Smoothed Residual Spatial Relative Risk From the Bayesian Besag–York–Mollié Model</w:t>
+      </w:r>
+    </w:p>
+    <w:p>
+      <w:pPr>
+        <w:spacing w:after="80"/>
+        <w:jc w:val="left"/>
+      </w:pPr>
+      <w:r>
+        <w:drawing>
+          <wp:inline distT="0" distB="0" distL="0" distR="0">
+            <wp:extent cx="4476750" cy="3914775"/>
+            <wp:effectExtent t="0" r="0" b="0" l="0"/>
+            <wp:docPr id="1" name="" descr="" title=""/>
+            <wp:cNvGraphicFramePr>
+              <a:graphicFrameLocks xmlns:a="http://schemas.openxmlformats.org/drawingml/2006/main" noChangeAspect="1"/>
+            </wp:cNvGraphicFramePr>
+            <a:graphic xmlns:a="http://schemas.openxmlformats.org/drawingml/2006/main">
+              <a:graphicData uri="http://schemas.openxmlformats.org/drawingml/2006/picture">
+                <pic:pic xmlns:pic="http://schemas.openxmlformats.org/drawingml/2006/picture">
+                  <pic:nvPicPr>
+                    <pic:cNvPr id="0" name="" descr=""/>
+                    <pic:cNvPicPr>
+                      <a:picLocks noChangeAspect="1" noChangeArrowheads="1"/>
+                    </pic:cNvPicPr>
+                  </pic:nvPicPr>
+                  <pic:blipFill>
+                    <a:blip r:embed="rId10" cstate="none"/>
+                    <a:srcRect/>
+                    <a:stretch>
+                      <a:fillRect/>
+                    </a:stretch>
+                  </pic:blipFill>
+                  <pic:spPr bwMode="auto">
+                    <a:xfrm>
+                      <a:off x="0" y="0"/>
+                      <a:ext cx="4476750" cy="3914775"/>
+                    </a:xfrm>
+                    <a:prstGeom prst="rect">
+                      <a:avLst/>
+                    </a:prstGeom>
+                  </pic:spPr>
+                </pic:pic>
+              </a:graphicData>
+            </a:graphic>
+          </wp:inline>
+        </w:drawing>
+      </w:r>
+    </w:p>
+    <w:p>
+      <w:pPr>
+        <w:spacing w:before="40" w:line="240"/>
+      </w:pPr>
+      <w:r>
+        <w:rPr>
+          <w:rFonts w:ascii="Times New Roman" w:cs="Times New Roman" w:eastAsia="Times New Roman" w:hAnsi="Times New Roman"/>
+          <w:b w:val="false"/>
+          <w:bCs w:val="false"/>
+          <w:i/>
+          <w:iCs/>
+          <w:sz w:val="24"/>
+          <w:szCs w:val="24"/>
+        </w:rPr>
+        <w:t xml:space="preserve">Note.</w:t>
+      </w:r>
+      <w:r>
+        <w:rPr>
+          <w:rFonts w:ascii="Times New Roman" w:cs="Times New Roman" w:eastAsia="Times New Roman" w:hAnsi="Times New Roman"/>
+          <w:b w:val="false"/>
+          <w:bCs w:val="false"/>
+          <w:i w:val="false"/>
+          <w:iCs w:val="false"/>
+          <w:sz w:val="24"/>
+          <w:szCs w:val="24"/>
+        </w:rPr>
+        <w:t xml:space="preserve"> Posterior mean of the structured spatial random effect, exp(</w:t>
+      </w:r>
+      <w:r>
+        <w:rPr>
+          <w:rFonts w:ascii="Times New Roman" w:cs="Times New Roman" w:eastAsia="Times New Roman" w:hAnsi="Times New Roman"/>
+          <w:b w:val="false"/>
+          <w:bCs w:val="false"/>
+          <w:i/>
+          <w:iCs/>
+          <w:sz w:val="24"/>
+          <w:szCs w:val="24"/>
+        </w:rPr>
+        <w:t xml:space="preserve">u</w:t>
+      </w:r>
+      <w:r>
+        <w:rPr>
+          <w:rFonts w:ascii="Times New Roman" w:cs="Times New Roman" w:eastAsia="Times New Roman" w:hAnsi="Times New Roman"/>
+          <w:b w:val="false"/>
+          <w:bCs w:val="false"/>
+          <w:i w:val="false"/>
+          <w:iCs w:val="false"/>
+          <w:sz w:val="24"/>
+          <w:szCs w:val="24"/>
+        </w:rPr>
+        <w:t xml:space="preserve">), after adjustment for rainfall seasonality and population density. Values above 1 (red) indicate residual excess risk; a coherent central–eastern belt persists, with the lowest residual risk in the south-west. Spatial fraction </w:t>
+      </w:r>
+      <w:r>
+        <w:rPr>
+          <w:rFonts w:ascii="Times New Roman" w:cs="Times New Roman" w:eastAsia="Times New Roman" w:hAnsi="Times New Roman"/>
+          <w:b w:val="false"/>
+          <w:bCs w:val="false"/>
+          <w:i/>
+          <w:iCs/>
+          <w:sz w:val="24"/>
+          <w:szCs w:val="24"/>
+        </w:rPr>
+        <w:t xml:space="preserve">φ</w:t>
+      </w:r>
+      <w:r>
+        <w:rPr>
+          <w:rFonts w:ascii="Times New Roman" w:cs="Times New Roman" w:eastAsia="Times New Roman" w:hAnsi="Times New Roman"/>
+          <w:b w:val="false"/>
+          <w:bCs w:val="false"/>
+          <w:i w:val="false"/>
+          <w:iCs w:val="false"/>
+          <w:sz w:val="24"/>
+          <w:szCs w:val="24"/>
+        </w:rPr>
+        <w:t xml:space="preserve"> = 0.22, 95% CrI [0.00, 0.85].</w:t>
       </w:r>
     </w:p>
     <w:sectPr>

</xml_diff>